<commit_message>
update 1 and 2 instructions
</commit_message>
<xml_diff>
--- a/Intro_to_R_class_1/Introduction_to_R_class_1.docx
+++ b/Intro_to_R_class_1/Introduction_to_R_class_1.docx
@@ -21,13 +21,7 @@
         <w:pStyle w:val="Author"/>
       </w:pPr>
       <w:r>
-        <w:t xml:space="preserve">Tomasz Gaczorek, Wiesław Babik &amp; Mateusz Chechetkin</w:t>
-      </w:r>
-      <w:r>
-        <w:t xml:space="preserve"> </w:t>
-      </w:r>
-      <w:r>
-        <w:t xml:space="preserve">Marzena Marszałek</w:t>
+        <w:t xml:space="preserve">Tomasz Gaczorek, Wiesław Babik, Mateusz Chechetkin &amp; Marzena Marszałek</w:t>
       </w:r>
       <w:r>
         <w:t xml:space="preserve"> </w:t>
@@ -46,63 +40,32 @@
         <w:pStyle w:val="Date"/>
       </w:pPr>
       <w:r>
-        <w:t xml:space="preserve">2025-08-04</w:t>
-      </w:r>
-    </w:p>
-    <w:p>
-      <w:pPr>
-        <w:pStyle w:val="SourceCode"/>
-      </w:pPr>
-      <w:r>
-        <w:rPr>
-          <w:rStyle w:val="NormalTok"/>
-        </w:rPr>
-        <w:t xml:space="preserve">knitr</w:t>
-      </w:r>
-      <w:r>
-        <w:rPr>
-          <w:rStyle w:val="SpecialCharTok"/>
-        </w:rPr>
-        <w:t xml:space="preserve">::</w:t>
-      </w:r>
-      <w:r>
-        <w:rPr>
-          <w:rStyle w:val="NormalTok"/>
-        </w:rPr>
-        <w:t xml:space="preserve">opts_chunk</w:t>
-      </w:r>
-      <w:r>
-        <w:rPr>
-          <w:rStyle w:val="SpecialCharTok"/>
-        </w:rPr>
-        <w:t xml:space="preserve">$</w:t>
-      </w:r>
-      <w:r>
-        <w:rPr>
-          <w:rStyle w:val="FunctionTok"/>
-        </w:rPr>
-        <w:t xml:space="preserve">set</w:t>
-      </w:r>
-      <w:r>
-        <w:rPr>
-          <w:rStyle w:val="NormalTok"/>
-        </w:rPr>
-        <w:t xml:space="preserve">(</w:t>
-      </w:r>
-      <w:r>
-        <w:rPr>
-          <w:rStyle w:val="AttributeTok"/>
-        </w:rPr>
-        <w:t xml:space="preserve">echo =</w:t>
-      </w:r>
-      <w:r>
-        <w:rPr>
-          <w:rStyle w:val="NormalTok"/>
-        </w:rPr>
-        <w:t xml:space="preserve"> T)</w:t>
-      </w:r>
-    </w:p>
-    <w:bookmarkStart w:id="10" w:name="what-is-r"/>
+        <w:t xml:space="preserve">2025-09-24</w:t>
+      </w:r>
+    </w:p>
+    <w:p>
+      <w:pPr>
+        <w:pStyle w:val="FirstParagraph"/>
+      </w:pPr>
+      <w:r>
+        <w:rPr>
+          <w:b/>
+          <w:bCs/>
+        </w:rPr>
+        <w:t xml:space="preserve">Descriptions of exercises are in green.</w:t>
+      </w:r>
+      <w:r>
+        <w:br/>
+      </w:r>
+      <w:r>
+        <w:rPr>
+          <w:b/>
+          <w:bCs/>
+        </w:rPr>
+        <w:t xml:space="preserve">Homeworks are in orange</w:t>
+      </w:r>
+    </w:p>
+    <w:bookmarkStart w:id="16" w:name="what-is-r"/>
     <w:p>
       <w:pPr>
         <w:pStyle w:val="Heading2"/>
@@ -116,7 +79,7 @@
         <w:pStyle w:val="FirstParagraph"/>
       </w:pPr>
       <w:r>
-        <w:t xml:space="preserve">R is an extremely powerful programming language, broadly used in the science for:</w:t>
+        <w:t xml:space="preserve">R is an extremely powerful programming language, broadly used in science for:</w:t>
       </w:r>
     </w:p>
     <w:p>
@@ -152,7 +115,7 @@
         </w:numPr>
       </w:pPr>
       <w:r>
-        <w:t xml:space="preserve">production of highly-customizable, publication quality graphs</w:t>
+        <w:t xml:space="preserve">production of highly customizable, publication-quality graphs</w:t>
       </w:r>
     </w:p>
     <w:p>
@@ -179,11 +142,10 @@
         <w:t xml:space="preserve">… and much more</w:t>
       </w:r>
     </w:p>
-    <w:bookmarkEnd w:id="10"/>
-    <w:bookmarkStart w:id="16" w:name="r-installation"/>
-    <w:p>
-      <w:pPr>
-        <w:pStyle w:val="Heading2"/>
+    <w:bookmarkStart w:id="15" w:name="r-installation"/>
+    <w:p>
+      <w:pPr>
+        <w:pStyle w:val="Heading3"/>
       </w:pPr>
       <w:r>
         <w:t xml:space="preserve">R installation</w:t>
@@ -194,7 +156,46 @@
         <w:pStyle w:val="FirstParagraph"/>
       </w:pPr>
       <w:r>
-        <w:t xml:space="preserve">To install R for Windows follow the</w:t>
+        <w:t xml:space="preserve">To install R for Windows, follow the</w:t>
+      </w:r>
+      <w:r>
+        <w:t xml:space="preserve"> </w:t>
+      </w:r>
+      <w:hyperlink r:id="rId10">
+        <w:r>
+          <w:rPr>
+            <w:rStyle w:val="Hyperlink"/>
+          </w:rPr>
+          <w:t xml:space="preserve">link</w:t>
+        </w:r>
+      </w:hyperlink>
+      <w:r>
+        <w:t xml:space="preserve"> </w:t>
+      </w:r>
+      <w:r>
+        <w:t xml:space="preserve">and then click on “Download R –</w:t>
+      </w:r>
+      <w:r>
+        <w:t xml:space="preserve"> </w:t>
+      </w:r>
+      <w:r>
+        <w:rPr>
+          <w:i/>
+          <w:iCs/>
+        </w:rPr>
+        <w:t xml:space="preserve">version_number</w:t>
+      </w:r>
+      <w:r>
+        <w:t xml:space="preserve"> </w:t>
+      </w:r>
+      <w:r>
+        <w:t xml:space="preserve">– for Windows”.</w:t>
+      </w:r>
+      <w:r>
+        <w:br/>
+      </w:r>
+      <w:r>
+        <w:t xml:space="preserve">To install R for OS X (Macs), follow the</w:t>
       </w:r>
       <w:r>
         <w:t xml:space="preserve"> </w:t>
@@ -211,52 +212,13 @@
         <w:t xml:space="preserve"> </w:t>
       </w:r>
       <w:r>
-        <w:t xml:space="preserve">and then click on “Download R –</w:t>
-      </w:r>
-      <w:r>
-        <w:t xml:space="preserve"> </w:t>
-      </w:r>
-      <w:r>
-        <w:rPr>
-          <w:i/>
-          <w:iCs/>
-        </w:rPr>
-        <w:t xml:space="preserve">version_number</w:t>
-      </w:r>
-      <w:r>
-        <w:t xml:space="preserve"> </w:t>
-      </w:r>
-      <w:r>
-        <w:t xml:space="preserve">– for Windows”.</w:t>
+        <w:t xml:space="preserve">and then click on “Download R for (Mac) OS X”</w:t>
       </w:r>
       <w:r>
         <w:br/>
       </w:r>
       <w:r>
-        <w:t xml:space="preserve">To install R for OS X (Macs) follow the</w:t>
-      </w:r>
-      <w:r>
-        <w:t xml:space="preserve"> </w:t>
-      </w:r>
-      <w:hyperlink r:id="rId12">
-        <w:r>
-          <w:rPr>
-            <w:rStyle w:val="Hyperlink"/>
-          </w:rPr>
-          <w:t xml:space="preserve">link</w:t>
-        </w:r>
-      </w:hyperlink>
-      <w:r>
-        <w:t xml:space="preserve"> </w:t>
-      </w:r>
-      <w:r>
-        <w:t xml:space="preserve">and then click on “Download R for (Mac) OS X”</w:t>
-      </w:r>
-      <w:r>
-        <w:br/>
-      </w:r>
-      <w:r>
-        <w:t xml:space="preserve">To install R for Linux type the lines below in the terminal.</w:t>
+        <w:t xml:space="preserve">To install R for Linux, type the lines below in the terminal.</w:t>
       </w:r>
     </w:p>
     <w:p>
@@ -308,18 +270,18 @@
           <wp:inline>
             <wp:extent cx="5334000" cy="3702423"/>
             <wp:effectExtent b="0" l="0" r="0" t="0"/>
-            <wp:docPr descr="" title="" id="14" name="Picture"/>
+            <wp:docPr descr="" title="" id="13" name="Picture"/>
             <a:graphic>
               <a:graphicData uri="http://schemas.openxmlformats.org/drawingml/2006/picture">
                 <pic:pic>
                   <pic:nvPicPr>
-                    <pic:cNvPr descr="R_start.png" id="15" name="Picture"/>
+                    <pic:cNvPr descr="R_start.png" id="14" name="Picture"/>
                     <pic:cNvPicPr>
                       <a:picLocks noChangeArrowheads="1" noChangeAspect="1"/>
                     </pic:cNvPicPr>
                   </pic:nvPicPr>
                   <pic:blipFill>
-                    <a:blip r:embed="rId13"/>
+                    <a:blip r:embed="rId12"/>
                     <a:stretch>
                       <a:fillRect/>
                     </a:stretch>
@@ -351,7 +313,7 @@
         <w:pStyle w:val="BodyText"/>
       </w:pPr>
       <w:r>
-        <w:t xml:space="preserve">It is so called</w:t>
+        <w:t xml:space="preserve">It is the so-called</w:t>
       </w:r>
       <w:r>
         <w:t xml:space="preserve"> </w:t>
@@ -364,9 +326,10 @@
         <w:t xml:space="preserve">R console</w:t>
       </w:r>
       <w:r>
-        <w:t xml:space="preserve">. Anything written and executed within a console will be interpreted (calculated) by R and a result or message will be printed out in the console.</w:t>
-      </w:r>
-    </w:p>
+        <w:t xml:space="preserve">. Anything written and executed within a console will be interpreted (calculated) by R, and the result or message will be printed out in the console.</w:t>
+      </w:r>
+    </w:p>
+    <w:bookmarkEnd w:id="15"/>
     <w:bookmarkEnd w:id="16"/>
     <w:bookmarkStart w:id="17" w:name="note-on-programming-vocabulary"/>
     <w:p>
@@ -491,36 +454,509 @@
         <w:t xml:space="preserve">: the thing you work on in R</w:t>
       </w:r>
     </w:p>
+    <w:bookmarkEnd w:id="17"/>
+    <w:bookmarkStart w:id="23" w:name="rstudio"/>
+    <w:p>
+      <w:pPr>
+        <w:pStyle w:val="Heading2"/>
+      </w:pPr>
+      <w:r>
+        <w:t xml:space="preserve">RStudio</w:t>
+      </w:r>
+    </w:p>
     <w:p>
       <w:pPr>
         <w:pStyle w:val="FirstParagraph"/>
       </w:pPr>
       <w:r>
-        <w:rPr>
-          <w:b/>
-          <w:bCs/>
-        </w:rPr>
-        <w:t xml:space="preserve">Descriptions of exercises are in green.</w:t>
+        <w:t xml:space="preserve">RStudio is a</w:t>
+      </w:r>
+      <w:r>
+        <w:t xml:space="preserve"> </w:t>
+      </w:r>
+      <w:r>
+        <w:rPr>
+          <w:b/>
+          <w:bCs/>
+        </w:rPr>
+        <w:t xml:space="preserve">shell</w:t>
+      </w:r>
+      <w:r>
+        <w:t xml:space="preserve"> </w:t>
+      </w:r>
+      <w:r>
+        <w:t xml:space="preserve">and</w:t>
+      </w:r>
+      <w:r>
+        <w:t xml:space="preserve"> </w:t>
+      </w:r>
+      <w:r>
+        <w:rPr>
+          <w:b/>
+          <w:bCs/>
+        </w:rPr>
+        <w:t xml:space="preserve">programming environment</w:t>
+      </w:r>
+      <w:r>
+        <w:t xml:space="preserve"> </w:t>
+      </w:r>
+      <w:r>
+        <w:t xml:space="preserve">for the R language. It makes working with R much easier and more intuitive by providing a</w:t>
+      </w:r>
+      <w:r>
+        <w:t xml:space="preserve"> </w:t>
+      </w:r>
+      <w:r>
+        <w:rPr>
+          <w:b/>
+          <w:bCs/>
+        </w:rPr>
+        <w:t xml:space="preserve">user interface</w:t>
+      </w:r>
+      <w:r>
+        <w:t xml:space="preserve"> </w:t>
+      </w:r>
+      <w:r>
+        <w:t xml:space="preserve">to R features originally hidden behind R functions. However, remember that</w:t>
+      </w:r>
+      <w:r>
+        <w:t xml:space="preserve"> </w:t>
+      </w:r>
+      <w:r>
+        <w:rPr>
+          <w:b/>
+          <w:bCs/>
+        </w:rPr>
+        <w:t xml:space="preserve">all actions can also be performed within the classical R console</w:t>
+      </w:r>
+      <w:r>
+        <w:t xml:space="preserve">.</w:t>
+      </w:r>
+    </w:p>
+    <w:bookmarkStart w:id="22" w:name="rstudio-installation"/>
+    <w:p>
+      <w:pPr>
+        <w:pStyle w:val="Heading3"/>
+      </w:pPr>
+      <w:r>
+        <w:t xml:space="preserve">RStudio installation</w:t>
+      </w:r>
+    </w:p>
+    <w:p>
+      <w:pPr>
+        <w:pStyle w:val="FirstParagraph"/>
+      </w:pPr>
+      <w:r>
+        <w:t xml:space="preserve">Follow the</w:t>
+      </w:r>
+      <w:r>
+        <w:t xml:space="preserve"> </w:t>
+      </w:r>
+      <w:hyperlink r:id="rId18">
+        <w:r>
+          <w:rPr>
+            <w:rStyle w:val="Hyperlink"/>
+          </w:rPr>
+          <w:t xml:space="preserve">link</w:t>
+        </w:r>
+      </w:hyperlink>
+      <w:r>
+        <w:t xml:space="preserve">, choose the appropriate operating system, and install free</w:t>
+      </w:r>
+      <w:r>
+        <w:t xml:space="preserve"> </w:t>
+      </w:r>
+      <w:r>
+        <w:rPr>
+          <w:b/>
+          <w:bCs/>
+        </w:rPr>
+        <w:t xml:space="preserve">RStudio Desktop</w:t>
+      </w:r>
+      <w:r>
+        <w:t xml:space="preserve">. Have in mind that</w:t>
+      </w:r>
+      <w:r>
+        <w:t xml:space="preserve"> </w:t>
+      </w:r>
+      <w:r>
+        <w:rPr>
+          <w:b/>
+          <w:bCs/>
+        </w:rPr>
+        <w:t xml:space="preserve">R needs to be installed first</w:t>
+      </w:r>
+      <w:r>
+        <w:t xml:space="preserve">.</w:t>
+      </w:r>
+    </w:p>
+    <w:p>
+      <w:pPr>
+        <w:pStyle w:val="BodyText"/>
+      </w:pPr>
+      <w:r>
+        <w:t xml:space="preserve">The RStudio interface is divided into four main panels, but today we will focus only on</w:t>
+      </w:r>
+      <w:r>
+        <w:t xml:space="preserve"> </w:t>
+      </w:r>
+      <w:r>
+        <w:rPr>
+          <w:b/>
+          <w:bCs/>
+        </w:rPr>
+        <w:t xml:space="preserve">the Console</w:t>
+      </w:r>
+      <w:r>
+        <w:t xml:space="preserve"> </w:t>
+      </w:r>
+      <w:r>
+        <w:t xml:space="preserve">panel, located in the lower-left corner. In the following classes, we will explore the other three panels, and learn how to use them effectively.</w:t>
+      </w:r>
+    </w:p>
+    <w:p>
+      <w:pPr>
+        <w:pStyle w:val="BodyText"/>
+      </w:pPr>
+      <w:r>
+        <w:drawing>
+          <wp:inline>
+            <wp:extent cx="5334000" cy="4370519"/>
+            <wp:effectExtent b="0" l="0" r="0" t="0"/>
+            <wp:docPr descr="" title="" id="20" name="Picture"/>
+            <a:graphic>
+              <a:graphicData uri="http://schemas.openxmlformats.org/drawingml/2006/picture">
+                <pic:pic>
+                  <pic:nvPicPr>
+                    <pic:cNvPr descr="/home/marzena.marszalek/Introduction_to_R_2024/Intro_to_R_class_1/rstudio-1.png" id="21" name="Picture"/>
+                    <pic:cNvPicPr>
+                      <a:picLocks noChangeArrowheads="1" noChangeAspect="1"/>
+                    </pic:cNvPicPr>
+                  </pic:nvPicPr>
+                  <pic:blipFill>
+                    <a:blip r:embed="rId19"/>
+                    <a:stretch>
+                      <a:fillRect/>
+                    </a:stretch>
+                  </pic:blipFill>
+                  <pic:spPr bwMode="auto">
+                    <a:xfrm>
+                      <a:off x="0" y="0"/>
+                      <a:ext cx="5334000" cy="4370519"/>
+                    </a:xfrm>
+                    <a:prstGeom prst="rect">
+                      <a:avLst/>
+                    </a:prstGeom>
+                    <a:noFill/>
+                    <a:ln w="9525">
+                      <a:noFill/>
+                      <a:headEnd/>
+                      <a:tailEnd/>
+                    </a:ln>
+                  </pic:spPr>
+                </pic:pic>
+              </a:graphicData>
+            </a:graphic>
+          </wp:inline>
+        </w:drawing>
+      </w:r>
+    </w:p>
+    <w:bookmarkEnd w:id="22"/>
+    <w:bookmarkEnd w:id="23"/>
+    <w:bookmarkStart w:id="29" w:name="r-as-a-typical-calculator"/>
+    <w:p>
+      <w:pPr>
+        <w:pStyle w:val="Heading2"/>
+      </w:pPr>
+      <w:r>
+        <w:t xml:space="preserve">R as a typical calculator</w:t>
+      </w:r>
+    </w:p>
+    <w:p>
+      <w:pPr>
+        <w:pStyle w:val="FirstParagraph"/>
+      </w:pPr>
+      <w:r>
+        <w:t xml:space="preserve">R understands standard mathematical operators:</w:t>
+      </w:r>
+      <w:r>
+        <w:t xml:space="preserve"> </w:t>
+      </w:r>
+      <w:r>
+        <w:rPr>
+          <w:rStyle w:val="VerbatimChar"/>
+        </w:rPr>
+        <w:t xml:space="preserve">+</w:t>
+      </w:r>
+      <w:r>
+        <w:t xml:space="preserve"> </w:t>
+      </w:r>
+      <w:r>
+        <w:t xml:space="preserve">(addition),</w:t>
+      </w:r>
+      <w:r>
+        <w:t xml:space="preserve"> </w:t>
+      </w:r>
+      <w:r>
+        <w:rPr>
+          <w:rStyle w:val="VerbatimChar"/>
+        </w:rPr>
+        <w:t xml:space="preserve">-</w:t>
+      </w:r>
+      <w:r>
+        <w:t xml:space="preserve"> </w:t>
+      </w:r>
+      <w:r>
+        <w:t xml:space="preserve">(subtraction),</w:t>
+      </w:r>
+      <w:r>
+        <w:t xml:space="preserve"> </w:t>
+      </w:r>
+      <w:r>
+        <w:rPr>
+          <w:rStyle w:val="VerbatimChar"/>
+        </w:rPr>
+        <w:t xml:space="preserve">*</w:t>
+      </w:r>
+      <w:r>
+        <w:t xml:space="preserve"> </w:t>
+      </w:r>
+      <w:r>
+        <w:t xml:space="preserve">(multiplication),</w:t>
+      </w:r>
+      <w:r>
+        <w:t xml:space="preserve"> </w:t>
+      </w:r>
+      <w:r>
+        <w:rPr>
+          <w:rStyle w:val="VerbatimChar"/>
+        </w:rPr>
+        <w:t xml:space="preserve">/</w:t>
+      </w:r>
+      <w:r>
+        <w:t xml:space="preserve"> </w:t>
+      </w:r>
+      <w:r>
+        <w:t xml:space="preserve">(division), and</w:t>
+      </w:r>
+      <w:r>
+        <w:t xml:space="preserve"> </w:t>
+      </w:r>
+      <w:r>
+        <w:rPr>
+          <w:rStyle w:val="VerbatimChar"/>
+        </w:rPr>
+        <w:t xml:space="preserve">^</w:t>
+      </w:r>
+      <w:r>
+        <w:t xml:space="preserve"> </w:t>
+      </w:r>
+      <w:r>
+        <w:t xml:space="preserve">(power). We can perform mathematical operations on single values – numbers, as well as other objects made up of numbers.</w:t>
+      </w:r>
+    </w:p>
+    <w:bookmarkStart w:id="24" w:name="exercise-1"/>
+    <w:p>
+      <w:pPr>
+        <w:pStyle w:val="Heading3"/>
+      </w:pPr>
+      <w:r>
+        <w:rPr>
+          <w:b/>
+          <w:bCs/>
+        </w:rPr>
+        <w:t xml:space="preserve">Exercise 1</w:t>
+      </w:r>
+    </w:p>
+    <w:p>
+      <w:pPr>
+        <w:pStyle w:val="FirstParagraph"/>
+      </w:pPr>
+      <w:r>
+        <w:rPr>
+          <w:b/>
+          <w:bCs/>
+        </w:rPr>
+        <w:t xml:space="preserve">Sum up all numbers from 1 to 10 using the</w:t>
+      </w:r>
+      <w:r>
+        <w:rPr>
+          <w:b/>
+          <w:bCs/>
+        </w:rPr>
+        <w:t xml:space="preserve"> </w:t>
+      </w:r>
+      <w:r>
+        <w:rPr>
+          <w:rStyle w:val="VerbatimChar"/>
+          <w:b/>
+          <w:bCs/>
+        </w:rPr>
+        <w:t xml:space="preserve">+</w:t>
+      </w:r>
+      <w:r>
+        <w:rPr>
+          <w:b/>
+          <w:bCs/>
+        </w:rPr>
+        <w:t xml:space="preserve"> </w:t>
+      </w:r>
+      <w:r>
+        <w:rPr>
+          <w:b/>
+          <w:bCs/>
+        </w:rPr>
+        <w:t xml:space="preserve">operator.</w:t>
       </w:r>
       <w:r>
         <w:br/>
       </w:r>
       <w:r>
-        <w:rPr>
-          <w:b/>
-          <w:bCs/>
-        </w:rPr>
-        <w:t xml:space="preserve">Homeworks are in orange</w:t>
-      </w:r>
-    </w:p>
-    <w:bookmarkEnd w:id="17"/>
-    <w:bookmarkStart w:id="23" w:name="r-as-a-typical-calculator"/>
-    <w:p>
-      <w:pPr>
-        <w:pStyle w:val="Heading2"/>
-      </w:pPr>
-      <w:r>
-        <w:t xml:space="preserve">R as a typical calculator</w:t>
+        <w:t xml:space="preserve">Expected result:</w:t>
+      </w:r>
+    </w:p>
+    <w:p>
+      <w:pPr>
+        <w:pStyle w:val="SourceCode"/>
+      </w:pPr>
+      <w:r>
+        <w:rPr>
+          <w:rStyle w:val="DecValTok"/>
+        </w:rPr>
+        <w:t xml:space="preserve">1</w:t>
+      </w:r>
+      <w:r>
+        <w:rPr>
+          <w:rStyle w:val="SpecialCharTok"/>
+        </w:rPr>
+        <w:t xml:space="preserve">+</w:t>
+      </w:r>
+      <w:r>
+        <w:rPr>
+          <w:rStyle w:val="DecValTok"/>
+        </w:rPr>
+        <w:t xml:space="preserve">2</w:t>
+      </w:r>
+      <w:r>
+        <w:rPr>
+          <w:rStyle w:val="SpecialCharTok"/>
+        </w:rPr>
+        <w:t xml:space="preserve">+</w:t>
+      </w:r>
+      <w:r>
+        <w:rPr>
+          <w:rStyle w:val="DecValTok"/>
+        </w:rPr>
+        <w:t xml:space="preserve">3</w:t>
+      </w:r>
+      <w:r>
+        <w:rPr>
+          <w:rStyle w:val="SpecialCharTok"/>
+        </w:rPr>
+        <w:t xml:space="preserve">+</w:t>
+      </w:r>
+      <w:r>
+        <w:rPr>
+          <w:rStyle w:val="DecValTok"/>
+        </w:rPr>
+        <w:t xml:space="preserve">4</w:t>
+      </w:r>
+      <w:r>
+        <w:rPr>
+          <w:rStyle w:val="SpecialCharTok"/>
+        </w:rPr>
+        <w:t xml:space="preserve">+</w:t>
+      </w:r>
+      <w:r>
+        <w:rPr>
+          <w:rStyle w:val="DecValTok"/>
+        </w:rPr>
+        <w:t xml:space="preserve">5</w:t>
+      </w:r>
+      <w:r>
+        <w:rPr>
+          <w:rStyle w:val="SpecialCharTok"/>
+        </w:rPr>
+        <w:t xml:space="preserve">+</w:t>
+      </w:r>
+      <w:r>
+        <w:rPr>
+          <w:rStyle w:val="DecValTok"/>
+        </w:rPr>
+        <w:t xml:space="preserve">6</w:t>
+      </w:r>
+      <w:r>
+        <w:rPr>
+          <w:rStyle w:val="SpecialCharTok"/>
+        </w:rPr>
+        <w:t xml:space="preserve">+</w:t>
+      </w:r>
+      <w:r>
+        <w:rPr>
+          <w:rStyle w:val="DecValTok"/>
+        </w:rPr>
+        <w:t xml:space="preserve">7</w:t>
+      </w:r>
+      <w:r>
+        <w:rPr>
+          <w:rStyle w:val="SpecialCharTok"/>
+        </w:rPr>
+        <w:t xml:space="preserve">+</w:t>
+      </w:r>
+      <w:r>
+        <w:rPr>
+          <w:rStyle w:val="DecValTok"/>
+        </w:rPr>
+        <w:t xml:space="preserve">8</w:t>
+      </w:r>
+      <w:r>
+        <w:rPr>
+          <w:rStyle w:val="SpecialCharTok"/>
+        </w:rPr>
+        <w:t xml:space="preserve">+</w:t>
+      </w:r>
+      <w:r>
+        <w:rPr>
+          <w:rStyle w:val="DecValTok"/>
+        </w:rPr>
+        <w:t xml:space="preserve">9</w:t>
+      </w:r>
+      <w:r>
+        <w:rPr>
+          <w:rStyle w:val="SpecialCharTok"/>
+        </w:rPr>
+        <w:t xml:space="preserve">+</w:t>
+      </w:r>
+      <w:r>
+        <w:rPr>
+          <w:rStyle w:val="DecValTok"/>
+        </w:rPr>
+        <w:t xml:space="preserve">10</w:t>
+      </w:r>
+    </w:p>
+    <w:p>
+      <w:pPr>
+        <w:pStyle w:val="SourceCode"/>
+      </w:pPr>
+      <w:r>
+        <w:rPr>
+          <w:rStyle w:val="VerbatimChar"/>
+        </w:rPr>
+        <w:t xml:space="preserve">## [1] 55</w:t>
+      </w:r>
+    </w:p>
+    <w:bookmarkEnd w:id="24"/>
+    <w:bookmarkStart w:id="25" w:name="exercise-2"/>
+    <w:p>
+      <w:pPr>
+        <w:pStyle w:val="Heading3"/>
+      </w:pPr>
+      <w:r>
+        <w:rPr>
+          <w:b/>
+          <w:bCs/>
+        </w:rPr>
+        <w:t xml:space="preserve">Exercise 2</w:t>
       </w:r>
     </w:p>
     <w:p>
@@ -528,85 +964,93 @@
         <w:pStyle w:val="FirstParagraph"/>
       </w:pPr>
       <w:r>
-        <w:t xml:space="preserve">R understands standard mathematical operators:</w:t>
-      </w:r>
-      <w:r>
-        <w:t xml:space="preserve"> </w:t>
-      </w:r>
-      <w:r>
-        <w:rPr>
-          <w:rStyle w:val="VerbatimChar"/>
-        </w:rPr>
-        <w:t xml:space="preserve">+</w:t>
-      </w:r>
-      <w:r>
-        <w:t xml:space="preserve"> </w:t>
-      </w:r>
-      <w:r>
-        <w:t xml:space="preserve">(addition),</w:t>
-      </w:r>
-      <w:r>
-        <w:t xml:space="preserve"> </w:t>
-      </w:r>
-      <w:r>
-        <w:rPr>
-          <w:rStyle w:val="VerbatimChar"/>
-        </w:rPr>
-        <w:t xml:space="preserve">-</w:t>
-      </w:r>
-      <w:r>
-        <w:t xml:space="preserve"> </w:t>
-      </w:r>
-      <w:r>
-        <w:t xml:space="preserve">(subtraction),</w:t>
-      </w:r>
-      <w:r>
-        <w:t xml:space="preserve"> </w:t>
-      </w:r>
-      <w:r>
-        <w:rPr>
-          <w:rStyle w:val="VerbatimChar"/>
-        </w:rPr>
-        <w:t xml:space="preserve">*</w:t>
-      </w:r>
-      <w:r>
-        <w:t xml:space="preserve"> </w:t>
-      </w:r>
-      <w:r>
-        <w:t xml:space="preserve">(multiplication),</w:t>
-      </w:r>
-      <w:r>
-        <w:t xml:space="preserve"> </w:t>
-      </w:r>
-      <w:r>
-        <w:rPr>
-          <w:rStyle w:val="VerbatimChar"/>
-        </w:rPr>
-        <w:t xml:space="preserve">/</w:t>
-      </w:r>
-      <w:r>
-        <w:t xml:space="preserve"> </w:t>
-      </w:r>
-      <w:r>
-        <w:t xml:space="preserve">(division) and</w:t>
-      </w:r>
-      <w:r>
-        <w:t xml:space="preserve"> </w:t>
-      </w:r>
-      <w:r>
-        <w:rPr>
-          <w:rStyle w:val="VerbatimChar"/>
+        <w:rPr>
+          <w:b/>
+          <w:bCs/>
+        </w:rPr>
+        <w:t xml:space="preserve">Raise the result of exercise 1 to the power of 5.</w:t>
+      </w:r>
+      <w:r>
+        <w:br/>
+      </w:r>
+      <w:r>
+        <w:t xml:space="preserve">Expected result:</w:t>
+      </w:r>
+    </w:p>
+    <w:p>
+      <w:pPr>
+        <w:pStyle w:val="SourceCode"/>
+      </w:pPr>
+      <w:r>
+        <w:rPr>
+          <w:rStyle w:val="DecValTok"/>
+        </w:rPr>
+        <w:t xml:space="preserve">55</w:t>
+      </w:r>
+      <w:r>
+        <w:rPr>
+          <w:rStyle w:val="SpecialCharTok"/>
         </w:rPr>
         <w:t xml:space="preserve">^</w:t>
       </w:r>
       <w:r>
-        <w:t xml:space="preserve"> </w:t>
-      </w:r>
-      <w:r>
-        <w:t xml:space="preserve">(power). We can perform mathematical operations on single values – numbers, as well as other objects made up of numbers.</w:t>
-      </w:r>
-    </w:p>
-    <w:bookmarkStart w:id="18" w:name="exercise-1"/>
+        <w:rPr>
+          <w:rStyle w:val="DecValTok"/>
+        </w:rPr>
+        <w:t xml:space="preserve">5</w:t>
+      </w:r>
+    </w:p>
+    <w:p>
+      <w:pPr>
+        <w:pStyle w:val="SourceCode"/>
+      </w:pPr>
+      <w:r>
+        <w:rPr>
+          <w:rStyle w:val="VerbatimChar"/>
+        </w:rPr>
+        <w:t xml:space="preserve">## [1] 503284375</w:t>
+      </w:r>
+    </w:p>
+    <w:p>
+      <w:pPr>
+        <w:pStyle w:val="FirstParagraph"/>
+      </w:pPr>
+      <w:r>
+        <w:t xml:space="preserve">R also provides 2 additional operators:</w:t>
+      </w:r>
+      <w:r>
+        <w:br/>
+      </w:r>
+      <w:r>
+        <w:rPr>
+          <w:rStyle w:val="VerbatimChar"/>
+        </w:rPr>
+        <w:t xml:space="preserve">%%</w:t>
+      </w:r>
+      <w:r>
+        <w:t xml:space="preserve"> </w:t>
+      </w:r>
+      <w:r>
+        <w:t xml:space="preserve">- modulo - returns the reminder from the division</w:t>
+      </w:r>
+      <w:r>
+        <w:br/>
+      </w:r>
+      <w:r>
+        <w:rPr>
+          <w:rStyle w:val="VerbatimChar"/>
+        </w:rPr>
+        <w:t xml:space="preserve">%/%</w:t>
+      </w:r>
+      <w:r>
+        <w:t xml:space="preserve"> </w:t>
+      </w:r>
+      <w:r>
+        <w:t xml:space="preserve">- integer division - returns how many times one number fits into another</w:t>
+      </w:r>
+    </w:p>
+    <w:bookmarkEnd w:id="25"/>
+    <w:bookmarkStart w:id="26" w:name="exercise-3"/>
     <w:p>
       <w:pPr>
         <w:pStyle w:val="Heading3"/>
@@ -616,7 +1060,7 @@
           <w:b/>
           <w:bCs/>
         </w:rPr>
-        <w:t xml:space="preserve">Exercise 1</w:t>
+        <w:t xml:space="preserve">Exercise 3</w:t>
       </w:r>
     </w:p>
     <w:p>
@@ -628,36 +1072,7 @@
           <w:b/>
           <w:bCs/>
         </w:rPr>
-        <w:t xml:space="preserve">Sum up all numbers from 1 to 10 using the</w:t>
-      </w:r>
-      <w:r>
-        <w:rPr>
-          <w:b/>
-          <w:bCs/>
-        </w:rPr>
-        <w:t xml:space="preserve"> </w:t>
-      </w:r>
-      <w:r>
-        <w:rPr>
-          <w:rStyle w:val="VerbatimChar"/>
-          <w:b/>
-          <w:bCs/>
-        </w:rPr>
-        <w:t xml:space="preserve">+</w:t>
-      </w:r>
-      <w:r>
-        <w:rPr>
-          <w:b/>
-          <w:bCs/>
-        </w:rPr>
-        <w:t xml:space="preserve"> </w:t>
-      </w:r>
-      <w:r>
-        <w:rPr>
-          <w:b/>
-          <w:bCs/>
-        </w:rPr>
-        <w:t xml:space="preserve">operator.</w:t>
+        <w:t xml:space="preserve">For numbers 10, 156, 557, 777, and 1055, check which are divisible by 7.</w:t>
       </w:r>
       <w:r>
         <w:br/>
@@ -674,116 +1089,216 @@
         <w:rPr>
           <w:rStyle w:val="DecValTok"/>
         </w:rPr>
-        <w:t xml:space="preserve">1</w:t>
+        <w:t xml:space="preserve">10</w:t>
+      </w:r>
+      <w:r>
+        <w:rPr>
+          <w:rStyle w:val="NormalTok"/>
+        </w:rPr>
+        <w:t xml:space="preserve"> </w:t>
       </w:r>
       <w:r>
         <w:rPr>
           <w:rStyle w:val="SpecialCharTok"/>
         </w:rPr>
-        <w:t xml:space="preserve">+</w:t>
+        <w:t xml:space="preserve">%%</w:t>
+      </w:r>
+      <w:r>
+        <w:rPr>
+          <w:rStyle w:val="NormalTok"/>
+        </w:rPr>
+        <w:t xml:space="preserve"> </w:t>
       </w:r>
       <w:r>
         <w:rPr>
           <w:rStyle w:val="DecValTok"/>
         </w:rPr>
-        <w:t xml:space="preserve">2</w:t>
+        <w:t xml:space="preserve">7</w:t>
+      </w:r>
+    </w:p>
+    <w:p>
+      <w:pPr>
+        <w:pStyle w:val="SourceCode"/>
+      </w:pPr>
+      <w:r>
+        <w:rPr>
+          <w:rStyle w:val="VerbatimChar"/>
+        </w:rPr>
+        <w:t xml:space="preserve">## [1] 3</w:t>
+      </w:r>
+    </w:p>
+    <w:p>
+      <w:pPr>
+        <w:pStyle w:val="SourceCode"/>
+      </w:pPr>
+      <w:r>
+        <w:rPr>
+          <w:rStyle w:val="DecValTok"/>
+        </w:rPr>
+        <w:t xml:space="preserve">156</w:t>
+      </w:r>
+      <w:r>
+        <w:rPr>
+          <w:rStyle w:val="NormalTok"/>
+        </w:rPr>
+        <w:t xml:space="preserve"> </w:t>
       </w:r>
       <w:r>
         <w:rPr>
           <w:rStyle w:val="SpecialCharTok"/>
         </w:rPr>
-        <w:t xml:space="preserve">+</w:t>
+        <w:t xml:space="preserve">%%</w:t>
+      </w:r>
+      <w:r>
+        <w:rPr>
+          <w:rStyle w:val="NormalTok"/>
+        </w:rPr>
+        <w:t xml:space="preserve"> </w:t>
       </w:r>
       <w:r>
         <w:rPr>
           <w:rStyle w:val="DecValTok"/>
         </w:rPr>
-        <w:t xml:space="preserve">3</w:t>
+        <w:t xml:space="preserve">7</w:t>
+      </w:r>
+    </w:p>
+    <w:p>
+      <w:pPr>
+        <w:pStyle w:val="SourceCode"/>
+      </w:pPr>
+      <w:r>
+        <w:rPr>
+          <w:rStyle w:val="VerbatimChar"/>
+        </w:rPr>
+        <w:t xml:space="preserve">## [1] 2</w:t>
+      </w:r>
+    </w:p>
+    <w:p>
+      <w:pPr>
+        <w:pStyle w:val="SourceCode"/>
+      </w:pPr>
+      <w:r>
+        <w:rPr>
+          <w:rStyle w:val="DecValTok"/>
+        </w:rPr>
+        <w:t xml:space="preserve">557</w:t>
+      </w:r>
+      <w:r>
+        <w:rPr>
+          <w:rStyle w:val="NormalTok"/>
+        </w:rPr>
+        <w:t xml:space="preserve"> </w:t>
       </w:r>
       <w:r>
         <w:rPr>
           <w:rStyle w:val="SpecialCharTok"/>
         </w:rPr>
-        <w:t xml:space="preserve">+</w:t>
+        <w:t xml:space="preserve">%%</w:t>
+      </w:r>
+      <w:r>
+        <w:rPr>
+          <w:rStyle w:val="NormalTok"/>
+        </w:rPr>
+        <w:t xml:space="preserve"> </w:t>
       </w:r>
       <w:r>
         <w:rPr>
           <w:rStyle w:val="DecValTok"/>
         </w:rPr>
-        <w:t xml:space="preserve">4</w:t>
+        <w:t xml:space="preserve">7</w:t>
+      </w:r>
+    </w:p>
+    <w:p>
+      <w:pPr>
+        <w:pStyle w:val="SourceCode"/>
+      </w:pPr>
+      <w:r>
+        <w:rPr>
+          <w:rStyle w:val="VerbatimChar"/>
+        </w:rPr>
+        <w:t xml:space="preserve">## [1] 4</w:t>
+      </w:r>
+    </w:p>
+    <w:p>
+      <w:pPr>
+        <w:pStyle w:val="SourceCode"/>
+      </w:pPr>
+      <w:r>
+        <w:rPr>
+          <w:rStyle w:val="DecValTok"/>
+        </w:rPr>
+        <w:t xml:space="preserve">777</w:t>
+      </w:r>
+      <w:r>
+        <w:rPr>
+          <w:rStyle w:val="NormalTok"/>
+        </w:rPr>
+        <w:t xml:space="preserve"> </w:t>
       </w:r>
       <w:r>
         <w:rPr>
           <w:rStyle w:val="SpecialCharTok"/>
         </w:rPr>
-        <w:t xml:space="preserve">+</w:t>
+        <w:t xml:space="preserve">%%</w:t>
+      </w:r>
+      <w:r>
+        <w:rPr>
+          <w:rStyle w:val="NormalTok"/>
+        </w:rPr>
+        <w:t xml:space="preserve"> </w:t>
       </w:r>
       <w:r>
         <w:rPr>
           <w:rStyle w:val="DecValTok"/>
         </w:rPr>
-        <w:t xml:space="preserve">5</w:t>
+        <w:t xml:space="preserve">7</w:t>
+      </w:r>
+    </w:p>
+    <w:p>
+      <w:pPr>
+        <w:pStyle w:val="SourceCode"/>
+      </w:pPr>
+      <w:r>
+        <w:rPr>
+          <w:rStyle w:val="VerbatimChar"/>
+        </w:rPr>
+        <w:t xml:space="preserve">## [1] 0</w:t>
+      </w:r>
+    </w:p>
+    <w:p>
+      <w:pPr>
+        <w:pStyle w:val="SourceCode"/>
+      </w:pPr>
+      <w:r>
+        <w:rPr>
+          <w:rStyle w:val="DecValTok"/>
+        </w:rPr>
+        <w:t xml:space="preserve">1055</w:t>
+      </w:r>
+      <w:r>
+        <w:rPr>
+          <w:rStyle w:val="NormalTok"/>
+        </w:rPr>
+        <w:t xml:space="preserve"> </w:t>
       </w:r>
       <w:r>
         <w:rPr>
           <w:rStyle w:val="SpecialCharTok"/>
         </w:rPr>
-        <w:t xml:space="preserve">+</w:t>
+        <w:t xml:space="preserve">%%</w:t>
+      </w:r>
+      <w:r>
+        <w:rPr>
+          <w:rStyle w:val="NormalTok"/>
+        </w:rPr>
+        <w:t xml:space="preserve"> </w:t>
       </w:r>
       <w:r>
         <w:rPr>
           <w:rStyle w:val="DecValTok"/>
         </w:rPr>
-        <w:t xml:space="preserve">6</w:t>
-      </w:r>
-      <w:r>
-        <w:rPr>
-          <w:rStyle w:val="SpecialCharTok"/>
-        </w:rPr>
-        <w:t xml:space="preserve">+</w:t>
-      </w:r>
-      <w:r>
-        <w:rPr>
-          <w:rStyle w:val="DecValTok"/>
-        </w:rPr>
         <w:t xml:space="preserve">7</w:t>
       </w:r>
-      <w:r>
-        <w:rPr>
-          <w:rStyle w:val="SpecialCharTok"/>
-        </w:rPr>
-        <w:t xml:space="preserve">+</w:t>
-      </w:r>
-      <w:r>
-        <w:rPr>
-          <w:rStyle w:val="DecValTok"/>
-        </w:rPr>
-        <w:t xml:space="preserve">8</w:t>
-      </w:r>
-      <w:r>
-        <w:rPr>
-          <w:rStyle w:val="SpecialCharTok"/>
-        </w:rPr>
-        <w:t xml:space="preserve">+</w:t>
-      </w:r>
-      <w:r>
-        <w:rPr>
-          <w:rStyle w:val="DecValTok"/>
-        </w:rPr>
-        <w:t xml:space="preserve">9</w:t>
-      </w:r>
-      <w:r>
-        <w:rPr>
-          <w:rStyle w:val="SpecialCharTok"/>
-        </w:rPr>
-        <w:t xml:space="preserve">+</w:t>
-      </w:r>
-      <w:r>
-        <w:rPr>
-          <w:rStyle w:val="DecValTok"/>
-        </w:rPr>
-        <w:t xml:space="preserve">10</w:t>
-      </w:r>
     </w:p>
     <w:p>
       <w:pPr>
@@ -793,377 +1308,11 @@
         <w:rPr>
           <w:rStyle w:val="VerbatimChar"/>
         </w:rPr>
-        <w:t xml:space="preserve">## [1] 55</w:t>
-      </w:r>
-    </w:p>
-    <w:bookmarkEnd w:id="18"/>
-    <w:bookmarkStart w:id="19" w:name="exercise-2"/>
-    <w:p>
-      <w:pPr>
-        <w:pStyle w:val="Heading3"/>
-      </w:pPr>
-      <w:r>
-        <w:rPr>
-          <w:b/>
-          <w:bCs/>
-        </w:rPr>
-        <w:t xml:space="preserve">Exercise 2</w:t>
-      </w:r>
-    </w:p>
-    <w:p>
-      <w:pPr>
-        <w:pStyle w:val="FirstParagraph"/>
-      </w:pPr>
-      <w:r>
-        <w:rPr>
-          <w:b/>
-          <w:bCs/>
-        </w:rPr>
-        <w:t xml:space="preserve">Raise the result of exercise 1 to the power of 5.</w:t>
-      </w:r>
-      <w:r>
-        <w:br/>
-      </w:r>
-      <w:r>
-        <w:t xml:space="preserve">Expected result:</w:t>
-      </w:r>
-    </w:p>
-    <w:p>
-      <w:pPr>
-        <w:pStyle w:val="SourceCode"/>
-      </w:pPr>
-      <w:r>
-        <w:rPr>
-          <w:rStyle w:val="DecValTok"/>
-        </w:rPr>
-        <w:t xml:space="preserve">55</w:t>
-      </w:r>
-      <w:r>
-        <w:rPr>
-          <w:rStyle w:val="SpecialCharTok"/>
-        </w:rPr>
-        <w:t xml:space="preserve">^</w:t>
-      </w:r>
-      <w:r>
-        <w:rPr>
-          <w:rStyle w:val="DecValTok"/>
-        </w:rPr>
-        <w:t xml:space="preserve">5</w:t>
-      </w:r>
-    </w:p>
-    <w:p>
-      <w:pPr>
-        <w:pStyle w:val="SourceCode"/>
-      </w:pPr>
-      <w:r>
-        <w:rPr>
-          <w:rStyle w:val="VerbatimChar"/>
-        </w:rPr>
-        <w:t xml:space="preserve">## [1] 503284375</w:t>
-      </w:r>
-    </w:p>
-    <w:p>
-      <w:pPr>
-        <w:pStyle w:val="FirstParagraph"/>
-      </w:pPr>
-      <w:r>
-        <w:t xml:space="preserve">R also provides 2 additional operators:</w:t>
-      </w:r>
-      <w:r>
-        <w:br/>
-      </w:r>
-      <w:r>
-        <w:rPr>
-          <w:rStyle w:val="VerbatimChar"/>
-        </w:rPr>
-        <w:t xml:space="preserve">%%</w:t>
-      </w:r>
-      <w:r>
-        <w:t xml:space="preserve"> </w:t>
-      </w:r>
-      <w:r>
-        <w:t xml:space="preserve">- modulo - returns the rest from the division</w:t>
-      </w:r>
-      <w:r>
-        <w:br/>
-      </w:r>
-      <w:r>
-        <w:rPr>
-          <w:rStyle w:val="VerbatimChar"/>
-        </w:rPr>
-        <w:t xml:space="preserve">%/%</w:t>
-      </w:r>
-      <w:r>
-        <w:t xml:space="preserve"> </w:t>
-      </w:r>
-      <w:r>
-        <w:t xml:space="preserve">- integer division - returns how many times one number fits into another</w:t>
-      </w:r>
-    </w:p>
-    <w:bookmarkEnd w:id="19"/>
-    <w:bookmarkStart w:id="20" w:name="exercise-3"/>
-    <w:p>
-      <w:pPr>
-        <w:pStyle w:val="Heading3"/>
-      </w:pPr>
-      <w:r>
-        <w:rPr>
-          <w:b/>
-          <w:bCs/>
-        </w:rPr>
-        <w:t xml:space="preserve">Exercise 3</w:t>
-      </w:r>
-    </w:p>
-    <w:p>
-      <w:pPr>
-        <w:pStyle w:val="FirstParagraph"/>
-      </w:pPr>
-      <w:r>
-        <w:rPr>
-          <w:b/>
-          <w:bCs/>
-        </w:rPr>
-        <w:t xml:space="preserve">For numbers 10, 156, 557, 777 and 1055, check which are divisible by 7.</w:t>
-      </w:r>
-      <w:r>
-        <w:br/>
-      </w:r>
-      <w:r>
-        <w:t xml:space="preserve">Expected result:</w:t>
-      </w:r>
-    </w:p>
-    <w:p>
-      <w:pPr>
-        <w:pStyle w:val="SourceCode"/>
-      </w:pPr>
-      <w:r>
-        <w:rPr>
-          <w:rStyle w:val="DecValTok"/>
-        </w:rPr>
-        <w:t xml:space="preserve">10</w:t>
-      </w:r>
-      <w:r>
-        <w:rPr>
-          <w:rStyle w:val="NormalTok"/>
-        </w:rPr>
-        <w:t xml:space="preserve"> </w:t>
-      </w:r>
-      <w:r>
-        <w:rPr>
-          <w:rStyle w:val="SpecialCharTok"/>
-        </w:rPr>
-        <w:t xml:space="preserve">%%</w:t>
-      </w:r>
-      <w:r>
-        <w:rPr>
-          <w:rStyle w:val="NormalTok"/>
-        </w:rPr>
-        <w:t xml:space="preserve"> </w:t>
-      </w:r>
-      <w:r>
-        <w:rPr>
-          <w:rStyle w:val="DecValTok"/>
-        </w:rPr>
-        <w:t xml:space="preserve">7</w:t>
-      </w:r>
-    </w:p>
-    <w:p>
-      <w:pPr>
-        <w:pStyle w:val="SourceCode"/>
-      </w:pPr>
-      <w:r>
-        <w:rPr>
-          <w:rStyle w:val="VerbatimChar"/>
-        </w:rPr>
-        <w:t xml:space="preserve">## [1] 3</w:t>
-      </w:r>
-    </w:p>
-    <w:p>
-      <w:pPr>
-        <w:pStyle w:val="SourceCode"/>
-      </w:pPr>
-      <w:r>
-        <w:rPr>
-          <w:rStyle w:val="DecValTok"/>
-        </w:rPr>
-        <w:t xml:space="preserve">156</w:t>
-      </w:r>
-      <w:r>
-        <w:rPr>
-          <w:rStyle w:val="NormalTok"/>
-        </w:rPr>
-        <w:t xml:space="preserve"> </w:t>
-      </w:r>
-      <w:r>
-        <w:rPr>
-          <w:rStyle w:val="SpecialCharTok"/>
-        </w:rPr>
-        <w:t xml:space="preserve">%%</w:t>
-      </w:r>
-      <w:r>
-        <w:rPr>
-          <w:rStyle w:val="NormalTok"/>
-        </w:rPr>
-        <w:t xml:space="preserve"> </w:t>
-      </w:r>
-      <w:r>
-        <w:rPr>
-          <w:rStyle w:val="DecValTok"/>
-        </w:rPr>
-        <w:t xml:space="preserve">7</w:t>
-      </w:r>
-    </w:p>
-    <w:p>
-      <w:pPr>
-        <w:pStyle w:val="SourceCode"/>
-      </w:pPr>
-      <w:r>
-        <w:rPr>
-          <w:rStyle w:val="VerbatimChar"/>
-        </w:rPr>
-        <w:t xml:space="preserve">## [1] 2</w:t>
-      </w:r>
-    </w:p>
-    <w:p>
-      <w:pPr>
-        <w:pStyle w:val="SourceCode"/>
-      </w:pPr>
-      <w:r>
-        <w:rPr>
-          <w:rStyle w:val="DecValTok"/>
-        </w:rPr>
-        <w:t xml:space="preserve">557</w:t>
-      </w:r>
-      <w:r>
-        <w:rPr>
-          <w:rStyle w:val="NormalTok"/>
-        </w:rPr>
-        <w:t xml:space="preserve"> </w:t>
-      </w:r>
-      <w:r>
-        <w:rPr>
-          <w:rStyle w:val="SpecialCharTok"/>
-        </w:rPr>
-        <w:t xml:space="preserve">%%</w:t>
-      </w:r>
-      <w:r>
-        <w:rPr>
-          <w:rStyle w:val="NormalTok"/>
-        </w:rPr>
-        <w:t xml:space="preserve"> </w:t>
-      </w:r>
-      <w:r>
-        <w:rPr>
-          <w:rStyle w:val="DecValTok"/>
-        </w:rPr>
-        <w:t xml:space="preserve">7</w:t>
-      </w:r>
-    </w:p>
-    <w:p>
-      <w:pPr>
-        <w:pStyle w:val="SourceCode"/>
-      </w:pPr>
-      <w:r>
-        <w:rPr>
-          <w:rStyle w:val="VerbatimChar"/>
-        </w:rPr>
-        <w:t xml:space="preserve">## [1] 4</w:t>
-      </w:r>
-    </w:p>
-    <w:p>
-      <w:pPr>
-        <w:pStyle w:val="SourceCode"/>
-      </w:pPr>
-      <w:r>
-        <w:rPr>
-          <w:rStyle w:val="DecValTok"/>
-        </w:rPr>
-        <w:t xml:space="preserve">777</w:t>
-      </w:r>
-      <w:r>
-        <w:rPr>
-          <w:rStyle w:val="NormalTok"/>
-        </w:rPr>
-        <w:t xml:space="preserve"> </w:t>
-      </w:r>
-      <w:r>
-        <w:rPr>
-          <w:rStyle w:val="SpecialCharTok"/>
-        </w:rPr>
-        <w:t xml:space="preserve">%%</w:t>
-      </w:r>
-      <w:r>
-        <w:rPr>
-          <w:rStyle w:val="NormalTok"/>
-        </w:rPr>
-        <w:t xml:space="preserve"> </w:t>
-      </w:r>
-      <w:r>
-        <w:rPr>
-          <w:rStyle w:val="DecValTok"/>
-        </w:rPr>
-        <w:t xml:space="preserve">7</w:t>
-      </w:r>
-    </w:p>
-    <w:p>
-      <w:pPr>
-        <w:pStyle w:val="SourceCode"/>
-      </w:pPr>
-      <w:r>
-        <w:rPr>
-          <w:rStyle w:val="VerbatimChar"/>
-        </w:rPr>
-        <w:t xml:space="preserve">## [1] 0</w:t>
-      </w:r>
-    </w:p>
-    <w:p>
-      <w:pPr>
-        <w:pStyle w:val="SourceCode"/>
-      </w:pPr>
-      <w:r>
-        <w:rPr>
-          <w:rStyle w:val="DecValTok"/>
-        </w:rPr>
-        <w:t xml:space="preserve">1055</w:t>
-      </w:r>
-      <w:r>
-        <w:rPr>
-          <w:rStyle w:val="NormalTok"/>
-        </w:rPr>
-        <w:t xml:space="preserve"> </w:t>
-      </w:r>
-      <w:r>
-        <w:rPr>
-          <w:rStyle w:val="SpecialCharTok"/>
-        </w:rPr>
-        <w:t xml:space="preserve">%%</w:t>
-      </w:r>
-      <w:r>
-        <w:rPr>
-          <w:rStyle w:val="NormalTok"/>
-        </w:rPr>
-        <w:t xml:space="preserve"> </w:t>
-      </w:r>
-      <w:r>
-        <w:rPr>
-          <w:rStyle w:val="DecValTok"/>
-        </w:rPr>
-        <w:t xml:space="preserve">7</w:t>
-      </w:r>
-    </w:p>
-    <w:p>
-      <w:pPr>
-        <w:pStyle w:val="SourceCode"/>
-      </w:pPr>
-      <w:r>
-        <w:rPr>
-          <w:rStyle w:val="VerbatimChar"/>
-        </w:rPr>
         <w:t xml:space="preserve">## [1] 5</w:t>
       </w:r>
     </w:p>
-    <w:bookmarkEnd w:id="20"/>
-    <w:bookmarkStart w:id="21" w:name="exercise-4"/>
+    <w:bookmarkEnd w:id="26"/>
+    <w:bookmarkStart w:id="27" w:name="exercise-4"/>
     <w:p>
       <w:pPr>
         <w:pStyle w:val="Heading3"/>
@@ -1319,7 +1468,7 @@
           <w:i/>
           <w:iCs/>
         </w:rPr>
-        <w:t xml:space="preserve">An advice: R uses the standard order of mathematical operations. However, it is usually a good practice to use parentheses.</w:t>
+        <w:t xml:space="preserve">Advice: R follows the standard order of mathematical operations. However, it is usually a good practice to use parentheses.</w:t>
       </w:r>
     </w:p>
     <w:p>
@@ -1466,7 +1615,7 @@
         <w:pStyle w:val="BodyText"/>
       </w:pPr>
       <w:r>
-        <w:t xml:space="preserve">You can use them by including the desired number inside the parentheses e.g. exponent of e for</w:t>
+        <w:t xml:space="preserve">You can use them by including the desired number inside the parentheses, e.g. exponent of e for</w:t>
       </w:r>
       <w:r>
         <w:t xml:space="preserve"> </w:t>
@@ -1481,11 +1630,11 @@
         <w:t xml:space="preserve"> </w:t>
       </w:r>
       <w:r>
-        <w:t xml:space="preserve">or an angle in radians for any of trigonometric functions.</w:t>
-      </w:r>
-    </w:p>
-    <w:bookmarkEnd w:id="21"/>
-    <w:bookmarkStart w:id="22" w:name="exercise-5"/>
+        <w:t xml:space="preserve">or an angle in radians for any of the trigonometric functions.</w:t>
+      </w:r>
+    </w:p>
+    <w:bookmarkEnd w:id="27"/>
+    <w:bookmarkStart w:id="28" w:name="exercise-5"/>
     <w:p>
       <w:pPr>
         <w:pStyle w:val="Heading3"/>
@@ -1722,7 +1871,7 @@
         <w:t xml:space="preserve"> </w:t>
       </w:r>
       <w:r>
-        <w:t xml:space="preserve">is the frequency of given species,</w:t>
+        <w:t xml:space="preserve">is the frequency of the given species,</w:t>
       </w:r>
       <w:r>
         <w:br/>
@@ -2324,9 +2473,9 @@
         <w:t xml:space="preserve">## [1] 0.9502705</w:t>
       </w:r>
     </w:p>
-    <w:bookmarkEnd w:id="22"/>
-    <w:bookmarkEnd w:id="23"/>
-    <w:bookmarkStart w:id="28" w:name="variables"/>
+    <w:bookmarkEnd w:id="28"/>
+    <w:bookmarkEnd w:id="29"/>
+    <w:bookmarkStart w:id="34" w:name="variables"/>
     <w:p>
       <w:pPr>
         <w:pStyle w:val="Heading2"/>
@@ -2344,7 +2493,7 @@
           <w:b/>
           <w:bCs/>
         </w:rPr>
-        <w:t xml:space="preserve">Until you name something it does not exist in a computer memory!</w:t>
+        <w:t xml:space="preserve">Until you name something, it does not exist in a computer memory!</w:t>
       </w:r>
       <w:r>
         <w:t xml:space="preserve"> </w:t>
@@ -2386,7 +2535,7 @@
           <w:b/>
           <w:bCs/>
         </w:rPr>
-        <w:t xml:space="preserve">by using arrows (assignement symbol)</w:t>
+        <w:t xml:space="preserve">by using the arrow (assignment symbol)</w:t>
       </w:r>
       <w:r>
         <w:t xml:space="preserve"> </w:t>
@@ -2427,7 +2576,7 @@
         <w:t xml:space="preserve">.</w:t>
       </w:r>
     </w:p>
-    <w:bookmarkStart w:id="24" w:name="exercise-6"/>
+    <w:bookmarkStart w:id="30" w:name="exercise-6"/>
     <w:p>
       <w:pPr>
         <w:pStyle w:val="Heading3"/>
@@ -2449,7 +2598,7 @@
           <w:b/>
           <w:bCs/>
         </w:rPr>
-        <w:t xml:space="preserve">Try to save 5 as variable. Choose a variable name on your own. Then, type your variable’s name and press Enter.</w:t>
+        <w:t xml:space="preserve">Try to save 5 as a variable. Choose a variable name on your own. Then, type your variable’s name and press Enter.</w:t>
       </w:r>
     </w:p>
     <w:p>
@@ -2518,7 +2667,7 @@
           <w:i/>
           <w:iCs/>
         </w:rPr>
-        <w:t xml:space="preserve">An advice: The variable name is case sensitive and</w:t>
+        <w:t xml:space="preserve">Advice: The variable name is case sensitive and</w:t>
       </w:r>
       <w:r>
         <w:rPr>
@@ -2541,7 +2690,22 @@
           <w:i/>
           <w:iCs/>
         </w:rPr>
-        <w:t xml:space="preserve">. When you want to combine several words into one name use the underscore (_). By convention dots are used for function names and should be used with caution.</w:t>
+        <w:t xml:space="preserve">. When you want to combine several words into one name, use the underscore (</w:t>
+      </w:r>
+      <w:r>
+        <w:rPr>
+          <w:rStyle w:val="VerbatimChar"/>
+          <w:i/>
+          <w:iCs/>
+        </w:rPr>
+        <w:t xml:space="preserve">\_</w:t>
+      </w:r>
+      <w:r>
+        <w:rPr>
+          <w:i/>
+          <w:iCs/>
+        </w:rPr>
+        <w:t xml:space="preserve">). By convention, dots are used for function names and should be used with caution.</w:t>
       </w:r>
     </w:p>
     <w:p>
@@ -2549,7 +2713,7 @@
         <w:pStyle w:val="BodyText"/>
       </w:pPr>
       <w:r>
-        <w:t xml:space="preserve">Since the variable is saved, its name can replace the actual value in any R commands e.g. if 2 is assigned to x, both</w:t>
+        <w:t xml:space="preserve">Since the variable is saved, its name can replace the actual value in any R commands, e.g. if 2 is assigned to x, both</w:t>
       </w:r>
       <w:r>
         <w:t xml:space="preserve"> </w:t>
@@ -2582,8 +2746,8 @@
         <w:t xml:space="preserve">would result in 5.</w:t>
       </w:r>
     </w:p>
-    <w:bookmarkEnd w:id="24"/>
-    <w:bookmarkStart w:id="25" w:name="exercise-7"/>
+    <w:bookmarkEnd w:id="30"/>
+    <w:bookmarkStart w:id="31" w:name="exercise-7"/>
     <w:p>
       <w:pPr>
         <w:pStyle w:val="Heading3"/>
@@ -2605,7 +2769,7 @@
           <w:b/>
           <w:bCs/>
         </w:rPr>
-        <w:t xml:space="preserve">Using the table from exercise 5, calculate the range of species frequencies for both populations and save them as separate variables. Then using chosen names, calculate the absolute difference between ranges. Save it to a variable called</w:t>
+        <w:t xml:space="preserve">Using the table from exercise 5, calculate the range of species frequencies for both populations and save them as separate variables. Then, using chosen names, calculate the absolute difference between ranges. Save it to a variable called</w:t>
       </w:r>
       <w:r>
         <w:rPr>
@@ -2784,7 +2948,7 @@
         <w:t xml:space="preserve">overwritten</w:t>
       </w:r>
       <w:r>
-        <w:t xml:space="preserve">. It is done by assigning a new object to the already used variable’s name. Remember, however, that once you overwrite the variable</w:t>
+        <w:t xml:space="preserve">. It is done by assigning a new object to the already used variable’s name. Remember, however, that once you overwrite the variable,</w:t>
       </w:r>
       <w:r>
         <w:t xml:space="preserve"> </w:t>
@@ -2800,8 +2964,8 @@
         <w:t xml:space="preserve">.</w:t>
       </w:r>
     </w:p>
-    <w:bookmarkEnd w:id="25"/>
-    <w:bookmarkStart w:id="26" w:name="exercise-8"/>
+    <w:bookmarkEnd w:id="31"/>
+    <w:bookmarkStart w:id="32" w:name="exercise-8"/>
     <w:p>
       <w:pPr>
         <w:pStyle w:val="Heading3"/>
@@ -2941,7 +3105,7 @@
         <w:pStyle w:val="FirstParagraph"/>
       </w:pPr>
       <w:r>
-        <w:t xml:space="preserve">Variables can store not only numbers. The other very popular type of data is</w:t>
+        <w:t xml:space="preserve">Variables can store not only numbers. The other very popular type of data is a</w:t>
       </w:r>
       <w:r>
         <w:t xml:space="preserve"> </w:t>
@@ -2954,7 +3118,7 @@
         <w:t xml:space="preserve">string</w:t>
       </w:r>
       <w:r>
-        <w:t xml:space="preserve">. It is a text which behaves as a single object regardless of its length. To distinguish strings from variable names R requires usage of</w:t>
+        <w:t xml:space="preserve">. It is a text that behaves as a single object regardless of its length. To distinguish strings from variable names, R requires the use of</w:t>
       </w:r>
       <w:r>
         <w:t xml:space="preserve"> </w:t>
@@ -2982,8 +3146,8 @@
         <w:t xml:space="preserve">) around them.</w:t>
       </w:r>
     </w:p>
-    <w:bookmarkEnd w:id="26"/>
-    <w:bookmarkStart w:id="27" w:name="exercise-9"/>
+    <w:bookmarkEnd w:id="32"/>
+    <w:bookmarkStart w:id="33" w:name="exercise-9"/>
     <w:p>
       <w:pPr>
         <w:pStyle w:val="Heading3"/>
@@ -3064,7 +3228,7 @@
         <w:rPr>
           <w:rStyle w:val="StringTok"/>
         </w:rPr>
-        <w:t xml:space="preserve">"Your_Name"</w:t>
+        <w:t xml:space="preserve">"Your Name"</w:t>
       </w:r>
       <w:r>
         <w:br/>
@@ -3084,12 +3248,12 @@
         <w:rPr>
           <w:rStyle w:val="VerbatimChar"/>
         </w:rPr>
-        <w:t xml:space="preserve">## [1] "Your_Name"</w:t>
-      </w:r>
-    </w:p>
-    <w:bookmarkEnd w:id="27"/>
-    <w:bookmarkEnd w:id="28"/>
-    <w:bookmarkStart w:id="32" w:name="functions"/>
+        <w:t xml:space="preserve">## [1] "Your Name"</w:t>
+      </w:r>
+    </w:p>
+    <w:bookmarkEnd w:id="33"/>
+    <w:bookmarkEnd w:id="34"/>
+    <w:bookmarkStart w:id="38" w:name="functions"/>
     <w:p>
       <w:pPr>
         <w:pStyle w:val="Heading2"/>
@@ -3145,7 +3309,7 @@
         <w:t xml:space="preserve"> </w:t>
       </w:r>
       <w:r>
-        <w:t xml:space="preserve">to be installed. Think apps pre-loaded on your phone like a calculator or a calendar vs apps for specific uses you need to download separately. We will talk about packages in the next class.</w:t>
+        <w:t xml:space="preserve">to be installed. Think apps pre-loaded on your phone, like a calculator or a calendar, vs apps for specific uses you need to download separately. We will talk about packages in the next class.</w:t>
       </w:r>
     </w:p>
     <w:p>
@@ -3153,7 +3317,10 @@
         <w:pStyle w:val="BodyText"/>
       </w:pPr>
       <w:r>
-        <w:t xml:space="preserve">Functions we used before take only a single argument e.g. </w:t>
+        <w:t xml:space="preserve">Functions we used before take only a single argument, e.g.,</w:t>
+      </w:r>
+      <w:r>
+        <w:t xml:space="preserve"> </w:t>
       </w:r>
       <w:r>
         <w:rPr>
@@ -3165,7 +3332,7 @@
         <w:t xml:space="preserve"> </w:t>
       </w:r>
       <w:r>
-        <w:t xml:space="preserve">takes a number. However, it is rarely the case. List of function’s arguments and the way of usage can be found in</w:t>
+        <w:t xml:space="preserve">takes a number. However, it is rarely the case. The list of the function’s arguments and the way of usage can be found in the</w:t>
       </w:r>
       <w:r>
         <w:t xml:space="preserve"> </w:t>
@@ -3178,7 +3345,7 @@
         <w:t xml:space="preserve">function’s manual</w:t>
       </w:r>
       <w:r>
-        <w:t xml:space="preserve">. It can be reached by typing question mark (</w:t>
+        <w:t xml:space="preserve">. It can be reached by typing a question mark (</w:t>
       </w:r>
       <w:r>
         <w:rPr>
@@ -3190,7 +3357,7 @@
         <w:t xml:space="preserve">) followed by the function’s name.</w:t>
       </w:r>
     </w:p>
-    <w:bookmarkStart w:id="29" w:name="exercise-10"/>
+    <w:bookmarkStart w:id="35" w:name="exercise-10"/>
     <w:p>
       <w:pPr>
         <w:pStyle w:val="Heading3"/>
@@ -3212,7 +3379,7 @@
           <w:b/>
           <w:bCs/>
         </w:rPr>
-        <w:t xml:space="preserve">Open the manual for</w:t>
+        <w:t xml:space="preserve">Open the manual for the</w:t>
       </w:r>
       <w:r>
         <w:rPr>
@@ -3249,7 +3416,7 @@
         <w:pStyle w:val="BodyText"/>
       </w:pPr>
       <w:r>
-        <w:t xml:space="preserve">Usually the manual consists of 7 sections:</w:t>
+        <w:t xml:space="preserve">Usually, the manual consists of 7 sections:</w:t>
       </w:r>
     </w:p>
     <w:p>
@@ -3403,8 +3570,8 @@
         <w:t xml:space="preserve">EXAMPLES</w:t>
       </w:r>
     </w:p>
-    <w:bookmarkEnd w:id="29"/>
-    <w:bookmarkStart w:id="30" w:name="exercise-11"/>
+    <w:bookmarkEnd w:id="35"/>
+    <w:bookmarkStart w:id="36" w:name="exercise-11"/>
     <w:p>
       <w:pPr>
         <w:pStyle w:val="Heading3"/>
@@ -3426,7 +3593,7 @@
           <w:b/>
           <w:bCs/>
         </w:rPr>
-        <w:t xml:space="preserve">Use</w:t>
+        <w:t xml:space="preserve">Use the</w:t>
       </w:r>
       <w:r>
         <w:rPr>
@@ -3455,7 +3622,7 @@
           <w:b/>
           <w:bCs/>
         </w:rPr>
-        <w:t xml:space="preserve">function to stick the following words together: ’I’m’, ‘using’ and ‘R’. Don’t forget about quotation marks (</w:t>
+        <w:t xml:space="preserve">function to stick the following words together: ’I’m’, ‘using’, and ‘R’. Don’t forget about quotation marks (</w:t>
       </w:r>
       <w:r>
         <w:rPr>
@@ -3565,8 +3732,8 @@
         <w:t xml:space="preserve">.</w:t>
       </w:r>
     </w:p>
-    <w:bookmarkEnd w:id="30"/>
-    <w:bookmarkStart w:id="31" w:name="exercise-12"/>
+    <w:bookmarkEnd w:id="36"/>
+    <w:bookmarkStart w:id="37" w:name="exercise-12"/>
     <w:p>
       <w:pPr>
         <w:pStyle w:val="Heading3"/>
@@ -3588,7 +3755,7 @@
           <w:b/>
           <w:bCs/>
         </w:rPr>
-        <w:t xml:space="preserve">Use the same function as above but set another argument called</w:t>
+        <w:t xml:space="preserve">Use the same function as above, but set another argument called</w:t>
       </w:r>
       <w:r>
         <w:rPr>
@@ -3737,13 +3904,13 @@
         <w:t xml:space="preserve"> </w:t>
       </w:r>
       <w:r>
-        <w:t xml:space="preserve">that would be taken if no value is put into function.</w:t>
-      </w:r>
-      <w:r>
-        <w:t xml:space="preserve"> </w:t>
-      </w:r>
-      <w:r>
-        <w:t xml:space="preserve">In the above case, the default value for</w:t>
+        <w:t xml:space="preserve">that would be taken if no value is put into the function.</w:t>
+      </w:r>
+      <w:r>
+        <w:t xml:space="preserve"> </w:t>
+      </w:r>
+      <w:r>
+        <w:t xml:space="preserve">In the above case, the default value for the</w:t>
       </w:r>
       <w:r>
         <w:t xml:space="preserve"> </w:t>
@@ -3770,1077 +3937,1070 @@
           <w:i/>
           <w:iCs/>
         </w:rPr>
-        <w:t xml:space="preserve">An advice: It is a good practice to use argument names while calling a function. Although, R can “guess” the argument name by the order in which arguments are typed, it can work improperly when the number of arguments is not strictly defined (“…” sign in function description).</w:t>
-      </w:r>
-    </w:p>
-    <w:bookmarkEnd w:id="31"/>
-    <w:bookmarkEnd w:id="32"/>
-    <w:bookmarkStart w:id="38" w:name="vectors"/>
-    <w:p>
-      <w:pPr>
-        <w:pStyle w:val="Heading2"/>
-      </w:pPr>
-      <w:r>
-        <w:t xml:space="preserve">Vectors</w:t>
-      </w:r>
-    </w:p>
-    <w:p>
-      <w:pPr>
-        <w:pStyle w:val="FirstParagraph"/>
-      </w:pPr>
-      <w:r>
-        <w:t xml:space="preserve">Vector is a series of numbers (or strings) that are saved as a single</w:t>
-      </w:r>
-      <w:r>
-        <w:t xml:space="preserve"> </w:t>
-      </w:r>
-      <w:r>
-        <w:rPr>
-          <w:b/>
-          <w:bCs/>
-        </w:rPr>
-        <w:t xml:space="preserve">variable</w:t>
-      </w:r>
-      <w:r>
-        <w:t xml:space="preserve">. A new vector can be created with</w:t>
-      </w:r>
-      <w:r>
-        <w:t xml:space="preserve"> </w:t>
-      </w:r>
-      <w:r>
-        <w:rPr>
-          <w:rStyle w:val="VerbatimChar"/>
-        </w:rPr>
-        <w:t xml:space="preserve">c()</w:t>
-      </w:r>
-      <w:r>
-        <w:t xml:space="preserve"> </w:t>
-      </w:r>
-      <w:r>
-        <w:t xml:space="preserve">function in the following manner:</w:t>
-      </w:r>
-      <w:r>
-        <w:t xml:space="preserve"> </w:t>
-      </w:r>
-      <w:r>
-        <w:rPr>
-          <w:rStyle w:val="VerbatimChar"/>
-        </w:rPr>
-        <w:t xml:space="preserve">c(value_1,value_2,value_3,…)</w:t>
-      </w:r>
-      <w:r>
-        <w:t xml:space="preserve">.</w:t>
-      </w:r>
-    </w:p>
-    <w:bookmarkStart w:id="33" w:name="exercise-13"/>
-    <w:p>
-      <w:pPr>
-        <w:pStyle w:val="Heading3"/>
-      </w:pPr>
-      <w:r>
-        <w:rPr>
-          <w:b/>
-          <w:bCs/>
-        </w:rPr>
-        <w:t xml:space="preserve">Exercise 13</w:t>
-      </w:r>
-    </w:p>
-    <w:p>
-      <w:pPr>
-        <w:pStyle w:val="FirstParagraph"/>
-      </w:pPr>
-      <w:r>
-        <w:rPr>
-          <w:b/>
-          <w:bCs/>
-        </w:rPr>
-        <w:t xml:space="preserve">Create a vector containing integers from 5 to 10 and save it to a variable. Call it.</w:t>
-      </w:r>
-    </w:p>
-    <w:p>
-      <w:pPr>
-        <w:pStyle w:val="BodyText"/>
-      </w:pPr>
-      <w:r>
-        <w:t xml:space="preserve">Expected result:</w:t>
-      </w:r>
-    </w:p>
-    <w:p>
-      <w:pPr>
-        <w:pStyle w:val="SourceCode"/>
-      </w:pPr>
-      <w:r>
-        <w:rPr>
-          <w:rStyle w:val="NormalTok"/>
-        </w:rPr>
-        <w:t xml:space="preserve">v1 </w:t>
-      </w:r>
-      <w:r>
-        <w:rPr>
-          <w:rStyle w:val="OtherTok"/>
-        </w:rPr>
-        <w:t xml:space="preserve">&lt;-</w:t>
-      </w:r>
-      <w:r>
-        <w:rPr>
-          <w:rStyle w:val="NormalTok"/>
-        </w:rPr>
-        <w:t xml:space="preserve"> </w:t>
-      </w:r>
-      <w:r>
-        <w:rPr>
-          <w:rStyle w:val="FunctionTok"/>
-        </w:rPr>
-        <w:t xml:space="preserve">c</w:t>
-      </w:r>
-      <w:r>
-        <w:rPr>
-          <w:rStyle w:val="NormalTok"/>
-        </w:rPr>
-        <w:t xml:space="preserve">(</w:t>
-      </w:r>
-      <w:r>
-        <w:rPr>
-          <w:rStyle w:val="DecValTok"/>
-        </w:rPr>
-        <w:t xml:space="preserve">5</w:t>
-      </w:r>
-      <w:r>
-        <w:rPr>
-          <w:rStyle w:val="SpecialCharTok"/>
-        </w:rPr>
-        <w:t xml:space="preserve">:</w:t>
-      </w:r>
-      <w:r>
-        <w:rPr>
-          <w:rStyle w:val="DecValTok"/>
-        </w:rPr>
-        <w:t xml:space="preserve">10</w:t>
-      </w:r>
-      <w:r>
-        <w:rPr>
-          <w:rStyle w:val="NormalTok"/>
-        </w:rPr>
-        <w:t xml:space="preserve">)</w:t>
-      </w:r>
-      <w:r>
-        <w:br/>
-      </w:r>
-      <w:r>
-        <w:rPr>
-          <w:rStyle w:val="NormalTok"/>
-        </w:rPr>
-        <w:t xml:space="preserve">v1</w:t>
-      </w:r>
-    </w:p>
-    <w:p>
-      <w:pPr>
-        <w:pStyle w:val="SourceCode"/>
-      </w:pPr>
-      <w:r>
-        <w:rPr>
-          <w:rStyle w:val="VerbatimChar"/>
-        </w:rPr>
-        <w:t xml:space="preserve">## [1]  5  6  7  8  9 10</w:t>
-      </w:r>
-    </w:p>
-    <w:p>
-      <w:pPr>
-        <w:pStyle w:val="FirstParagraph"/>
-      </w:pPr>
-      <w:r>
-        <w:rPr>
+        <w:t xml:space="preserve">Advice: It is a good practice to use argument names while calling a function. Although R can “guess” the argument name by the order in which arguments are typed, it can work improperly when the number of arguments is not strictly defined (</w:t>
+      </w:r>
+      <w:r>
+        <w:rPr>
+          <w:rStyle w:val="VerbatimChar"/>
           <w:i/>
           <w:iCs/>
         </w:rPr>
-        <w:t xml:space="preserve">Tip: To create a vector of consecutive integers you can type the limits of the range separated by the colon.</w:t>
-      </w:r>
-    </w:p>
-    <w:bookmarkEnd w:id="33"/>
-    <w:bookmarkStart w:id="34" w:name="exercise-14"/>
-    <w:p>
-      <w:pPr>
-        <w:pStyle w:val="Heading3"/>
-      </w:pPr>
-      <w:r>
-        <w:rPr>
-          <w:b/>
-          <w:bCs/>
-        </w:rPr>
-        <w:t xml:space="preserve">Exercise 14</w:t>
-      </w:r>
-    </w:p>
-    <w:p>
-      <w:pPr>
-        <w:pStyle w:val="FirstParagraph"/>
-      </w:pPr>
-      <w:r>
-        <w:rPr>
-          <w:b/>
-          <w:bCs/>
-        </w:rPr>
-        <w:t xml:space="preserve">Create a vector containing integers from 1 to 100 and save it to a variable</w:t>
-      </w:r>
-      <w:r>
-        <w:rPr>
-          <w:b/>
-          <w:bCs/>
-        </w:rPr>
-        <w:t xml:space="preserve"> </w:t>
-      </w:r>
-      <w:r>
-        <w:rPr>
-          <w:rStyle w:val="VerbatimChar"/>
-          <w:b/>
-          <w:bCs/>
-        </w:rPr>
-        <w:t xml:space="preserve">one_to_hundred</w:t>
-      </w:r>
-      <w:r>
-        <w:rPr>
-          <w:b/>
-          <w:bCs/>
-        </w:rPr>
-        <w:t xml:space="preserve">. Call it.</w:t>
-      </w:r>
-    </w:p>
-    <w:p>
-      <w:pPr>
-        <w:pStyle w:val="BodyText"/>
-      </w:pPr>
-      <w:r>
-        <w:t xml:space="preserve">Expected result:</w:t>
-      </w:r>
-    </w:p>
-    <w:p>
-      <w:pPr>
-        <w:pStyle w:val="SourceCode"/>
-      </w:pPr>
-      <w:r>
-        <w:rPr>
-          <w:rStyle w:val="NormalTok"/>
-        </w:rPr>
-        <w:t xml:space="preserve">one_to_hundred </w:t>
-      </w:r>
-      <w:r>
-        <w:rPr>
-          <w:rStyle w:val="OtherTok"/>
-        </w:rPr>
-        <w:t xml:space="preserve">&lt;-</w:t>
-      </w:r>
-      <w:r>
-        <w:rPr>
-          <w:rStyle w:val="NormalTok"/>
-        </w:rPr>
-        <w:t xml:space="preserve"> </w:t>
-      </w:r>
-      <w:r>
-        <w:rPr>
-          <w:rStyle w:val="FunctionTok"/>
-        </w:rPr>
-        <w:t xml:space="preserve">c</w:t>
-      </w:r>
-      <w:r>
-        <w:rPr>
-          <w:rStyle w:val="NormalTok"/>
-        </w:rPr>
-        <w:t xml:space="preserve">(</w:t>
-      </w:r>
-      <w:r>
-        <w:rPr>
-          <w:rStyle w:val="DecValTok"/>
-        </w:rPr>
-        <w:t xml:space="preserve">1</w:t>
-      </w:r>
-      <w:r>
-        <w:rPr>
-          <w:rStyle w:val="SpecialCharTok"/>
-        </w:rPr>
-        <w:t xml:space="preserve">:</w:t>
-      </w:r>
-      <w:r>
-        <w:rPr>
-          <w:rStyle w:val="DecValTok"/>
-        </w:rPr>
-        <w:t xml:space="preserve">100</w:t>
-      </w:r>
-      <w:r>
-        <w:rPr>
-          <w:rStyle w:val="NormalTok"/>
-        </w:rPr>
-        <w:t xml:space="preserve">)</w:t>
-      </w:r>
-      <w:r>
-        <w:br/>
-      </w:r>
-      <w:r>
-        <w:rPr>
-          <w:rStyle w:val="NormalTok"/>
-        </w:rPr>
-        <w:t xml:space="preserve">one_to_hundred</w:t>
-      </w:r>
-    </w:p>
-    <w:p>
-      <w:pPr>
-        <w:pStyle w:val="SourceCode"/>
-      </w:pPr>
-      <w:r>
-        <w:rPr>
-          <w:rStyle w:val="VerbatimChar"/>
-        </w:rPr>
-        <w:t xml:space="preserve">##   [1]   1   2   3   4   5   6   7   8   9  10  11  12  13  14  15  16  17  18</w:t>
-      </w:r>
-      <w:r>
-        <w:br/>
-      </w:r>
-      <w:r>
-        <w:rPr>
-          <w:rStyle w:val="VerbatimChar"/>
-        </w:rPr>
-        <w:t xml:space="preserve">##  [19]  19  20  21  22  23  24  25  26  27  28  29  30  31  32  33  34  35  36</w:t>
-      </w:r>
-      <w:r>
-        <w:br/>
-      </w:r>
-      <w:r>
-        <w:rPr>
-          <w:rStyle w:val="VerbatimChar"/>
-        </w:rPr>
-        <w:t xml:space="preserve">##  [37]  37  38  39  40  41  42  43  44  45  46  47  48  49  50  51  52  53  54</w:t>
-      </w:r>
-      <w:r>
-        <w:br/>
-      </w:r>
-      <w:r>
-        <w:rPr>
-          <w:rStyle w:val="VerbatimChar"/>
-        </w:rPr>
-        <w:t xml:space="preserve">##  [55]  55  56  57  58  59  60  61  62  63  64  65  66  67  68  69  70  71  72</w:t>
-      </w:r>
-      <w:r>
-        <w:br/>
-      </w:r>
-      <w:r>
-        <w:rPr>
-          <w:rStyle w:val="VerbatimChar"/>
-        </w:rPr>
-        <w:t xml:space="preserve">##  [73]  73  74  75  76  77  78  79  80  81  82  83  84  85  86  87  88  89  90</w:t>
-      </w:r>
-      <w:r>
-        <w:br/>
-      </w:r>
-      <w:r>
-        <w:rPr>
-          <w:rStyle w:val="VerbatimChar"/>
-        </w:rPr>
-        <w:t xml:space="preserve">##  [91]  91  92  93  94  95  96  97  98  99 100</w:t>
-      </w:r>
-    </w:p>
-    <w:p>
-      <w:pPr>
-        <w:pStyle w:val="FirstParagraph"/>
-      </w:pPr>
+        <w:t xml:space="preserve">…</w:t>
+      </w:r>
       <w:r>
         <w:rPr>
           <w:i/>
           <w:iCs/>
         </w:rPr>
-        <w:t xml:space="preserve">An advice: Note that concerning ranges, R is fully inclusive which means that both limits of the range will be included in the final outcome.</w:t>
-      </w:r>
-    </w:p>
-    <w:p>
-      <w:pPr>
-        <w:pStyle w:val="BodyText"/>
-      </w:pPr>
-      <w:r>
-        <w:t xml:space="preserve">To create a vector of consecutive numbers which differ by a given value, use</w:t>
-      </w:r>
-      <w:r>
-        <w:t xml:space="preserve"> </w:t>
-      </w:r>
-      <w:r>
-        <w:rPr>
-          <w:rStyle w:val="VerbatimChar"/>
-        </w:rPr>
-        <w:t xml:space="preserve">seq()</w:t>
-      </w:r>
-      <w:r>
-        <w:t xml:space="preserve"> </w:t>
-      </w:r>
-      <w:r>
-        <w:t xml:space="preserve">function. Note that the function will return a vector so there is no need to use</w:t>
-      </w:r>
-      <w:r>
-        <w:t xml:space="preserve"> </w:t>
-      </w:r>
-      <w:r>
-        <w:rPr>
-          <w:rStyle w:val="VerbatimChar"/>
-        </w:rPr>
-        <w:t xml:space="preserve">c()</w:t>
-      </w:r>
-      <w:r>
-        <w:t xml:space="preserve">.</w:t>
-      </w:r>
-    </w:p>
-    <w:bookmarkEnd w:id="34"/>
-    <w:bookmarkStart w:id="35" w:name="exercise-15"/>
-    <w:p>
-      <w:pPr>
-        <w:pStyle w:val="Heading3"/>
-      </w:pPr>
-      <w:r>
-        <w:rPr>
-          <w:b/>
-          <w:bCs/>
-        </w:rPr>
-        <w:t xml:space="preserve">Exercise 15</w:t>
-      </w:r>
-    </w:p>
-    <w:p>
-      <w:pPr>
-        <w:pStyle w:val="FirstParagraph"/>
-      </w:pPr>
-      <w:r>
-        <w:rPr>
-          <w:b/>
-          <w:bCs/>
-        </w:rPr>
-        <w:t xml:space="preserve">Access</w:t>
-      </w:r>
-      <w:r>
-        <w:rPr>
-          <w:b/>
-          <w:bCs/>
-        </w:rPr>
-        <w:t xml:space="preserve"> </w:t>
-      </w:r>
-      <w:r>
-        <w:rPr>
-          <w:rStyle w:val="VerbatimChar"/>
-          <w:b/>
-          <w:bCs/>
-        </w:rPr>
-        <w:t xml:space="preserve">seq()</w:t>
-      </w:r>
-      <w:r>
-        <w:rPr>
-          <w:b/>
-          <w:bCs/>
-        </w:rPr>
-        <w:t xml:space="preserve"> </w:t>
-      </w:r>
-      <w:r>
-        <w:rPr>
-          <w:b/>
-          <w:bCs/>
-        </w:rPr>
-        <w:t xml:space="preserve">manual. Using</w:t>
-      </w:r>
-      <w:r>
-        <w:rPr>
-          <w:b/>
-          <w:bCs/>
-        </w:rPr>
-        <w:t xml:space="preserve"> </w:t>
-      </w:r>
-      <w:r>
-        <w:rPr>
-          <w:rStyle w:val="VerbatimChar"/>
-          <w:b/>
-          <w:bCs/>
-        </w:rPr>
-        <w:t xml:space="preserve">seq()</w:t>
-      </w:r>
-      <w:r>
-        <w:rPr>
-          <w:b/>
-          <w:bCs/>
-        </w:rPr>
-        <w:t xml:space="preserve"> </w:t>
-      </w:r>
-      <w:r>
-        <w:rPr>
-          <w:b/>
-          <w:bCs/>
-        </w:rPr>
-        <w:t xml:space="preserve">function, create a vector of numbers between 0 and 1 that differ by 0.1.</w:t>
-      </w:r>
-    </w:p>
-    <w:p>
-      <w:pPr>
-        <w:pStyle w:val="BodyText"/>
-      </w:pPr>
-      <w:r>
-        <w:t xml:space="preserve">Expected result:</w:t>
-      </w:r>
-    </w:p>
-    <w:p>
-      <w:pPr>
-        <w:pStyle w:val="SourceCode"/>
-      </w:pPr>
-      <w:r>
-        <w:rPr>
-          <w:rStyle w:val="NormalTok"/>
-        </w:rPr>
-        <w:t xml:space="preserve">v2 </w:t>
-      </w:r>
-      <w:r>
-        <w:rPr>
-          <w:rStyle w:val="OtherTok"/>
-        </w:rPr>
-        <w:t xml:space="preserve">&lt;-</w:t>
-      </w:r>
-      <w:r>
-        <w:rPr>
-          <w:rStyle w:val="NormalTok"/>
-        </w:rPr>
-        <w:t xml:space="preserve"> </w:t>
-      </w:r>
-      <w:r>
-        <w:rPr>
-          <w:rStyle w:val="FunctionTok"/>
-        </w:rPr>
-        <w:t xml:space="preserve">seq</w:t>
-      </w:r>
-      <w:r>
-        <w:rPr>
-          <w:rStyle w:val="NormalTok"/>
-        </w:rPr>
-        <w:t xml:space="preserve">(</w:t>
-      </w:r>
-      <w:r>
-        <w:rPr>
-          <w:rStyle w:val="AttributeTok"/>
-        </w:rPr>
-        <w:t xml:space="preserve">from =</w:t>
-      </w:r>
-      <w:r>
-        <w:rPr>
-          <w:rStyle w:val="NormalTok"/>
-        </w:rPr>
-        <w:t xml:space="preserve"> </w:t>
-      </w:r>
-      <w:r>
-        <w:rPr>
-          <w:rStyle w:val="DecValTok"/>
-        </w:rPr>
-        <w:t xml:space="preserve">0</w:t>
-      </w:r>
-      <w:r>
-        <w:rPr>
-          <w:rStyle w:val="NormalTok"/>
-        </w:rPr>
-        <w:t xml:space="preserve">, </w:t>
-      </w:r>
-      <w:r>
-        <w:rPr>
-          <w:rStyle w:val="AttributeTok"/>
-        </w:rPr>
-        <w:t xml:space="preserve">to =</w:t>
-      </w:r>
-      <w:r>
-        <w:rPr>
-          <w:rStyle w:val="NormalTok"/>
-        </w:rPr>
-        <w:t xml:space="preserve"> </w:t>
-      </w:r>
-      <w:r>
-        <w:rPr>
-          <w:rStyle w:val="DecValTok"/>
-        </w:rPr>
-        <w:t xml:space="preserve">1</w:t>
-      </w:r>
-      <w:r>
-        <w:rPr>
-          <w:rStyle w:val="NormalTok"/>
-        </w:rPr>
-        <w:t xml:space="preserve">, </w:t>
-      </w:r>
-      <w:r>
-        <w:rPr>
-          <w:rStyle w:val="AttributeTok"/>
-        </w:rPr>
-        <w:t xml:space="preserve">by =</w:t>
-      </w:r>
-      <w:r>
-        <w:rPr>
-          <w:rStyle w:val="NormalTok"/>
-        </w:rPr>
-        <w:t xml:space="preserve"> </w:t>
-      </w:r>
-      <w:r>
-        <w:rPr>
-          <w:rStyle w:val="FloatTok"/>
-        </w:rPr>
-        <w:t xml:space="preserve">0.1</w:t>
-      </w:r>
-      <w:r>
-        <w:rPr>
-          <w:rStyle w:val="NormalTok"/>
-        </w:rPr>
-        <w:t xml:space="preserve">)</w:t>
-      </w:r>
-      <w:r>
-        <w:br/>
-      </w:r>
-      <w:r>
-        <w:rPr>
-          <w:rStyle w:val="NormalTok"/>
-        </w:rPr>
-        <w:t xml:space="preserve">v2</w:t>
-      </w:r>
-    </w:p>
-    <w:p>
-      <w:pPr>
-        <w:pStyle w:val="SourceCode"/>
-      </w:pPr>
-      <w:r>
-        <w:rPr>
-          <w:rStyle w:val="VerbatimChar"/>
-        </w:rPr>
-        <w:t xml:space="preserve">##  [1] 0.0 0.1 0.2 0.3 0.4 0.5 0.6 0.7 0.8 0.9 1.0</w:t>
-      </w:r>
-    </w:p>
-    <w:p>
-      <w:pPr>
-        <w:pStyle w:val="FirstParagraph"/>
-      </w:pPr>
-      <w:r>
-        <w:t xml:space="preserve">To create a vector of repeated values, use</w:t>
-      </w:r>
-      <w:r>
-        <w:t xml:space="preserve"> </w:t>
-      </w:r>
-      <w:r>
-        <w:rPr>
-          <w:rStyle w:val="VerbatimChar"/>
-        </w:rPr>
-        <w:t xml:space="preserve">rep()</w:t>
-      </w:r>
-      <w:r>
-        <w:t xml:space="preserve"> </w:t>
-      </w:r>
-      <w:r>
-        <w:t xml:space="preserve">function.</w:t>
-      </w:r>
-    </w:p>
-    <w:bookmarkEnd w:id="35"/>
-    <w:bookmarkStart w:id="36" w:name="exercise-16"/>
-    <w:p>
-      <w:pPr>
-        <w:pStyle w:val="Heading3"/>
-      </w:pPr>
-      <w:r>
-        <w:rPr>
-          <w:b/>
-          <w:bCs/>
-        </w:rPr>
-        <w:t xml:space="preserve">Exercise 16</w:t>
-      </w:r>
-    </w:p>
-    <w:p>
-      <w:pPr>
-        <w:pStyle w:val="FirstParagraph"/>
-      </w:pPr>
-      <w:r>
-        <w:rPr>
-          <w:b/>
-          <w:bCs/>
-        </w:rPr>
-        <w:t xml:space="preserve">Access</w:t>
-      </w:r>
-      <w:r>
-        <w:rPr>
-          <w:b/>
-          <w:bCs/>
-        </w:rPr>
-        <w:t xml:space="preserve"> </w:t>
-      </w:r>
-      <w:r>
-        <w:rPr>
-          <w:rStyle w:val="VerbatimChar"/>
-          <w:b/>
-          <w:bCs/>
-        </w:rPr>
-        <w:t xml:space="preserve">rep()</w:t>
-      </w:r>
-      <w:r>
-        <w:rPr>
-          <w:b/>
-          <w:bCs/>
-        </w:rPr>
-        <w:t xml:space="preserve"> </w:t>
-      </w:r>
-      <w:r>
-        <w:rPr>
-          <w:b/>
-          <w:bCs/>
-        </w:rPr>
-        <w:t xml:space="preserve">manual by typing</w:t>
-      </w:r>
-      <w:r>
-        <w:rPr>
-          <w:b/>
-          <w:bCs/>
-        </w:rPr>
-        <w:t xml:space="preserve"> </w:t>
-      </w:r>
-      <w:r>
-        <w:rPr>
-          <w:rStyle w:val="VerbatimChar"/>
-          <w:b/>
-          <w:bCs/>
-        </w:rPr>
-        <w:t xml:space="preserve">?rep</w:t>
-      </w:r>
-      <w:r>
-        <w:rPr>
-          <w:b/>
-          <w:bCs/>
-        </w:rPr>
-        <w:t xml:space="preserve"> </w:t>
-      </w:r>
-      <w:r>
-        <w:rPr>
-          <w:b/>
-          <w:bCs/>
-        </w:rPr>
-        <w:t xml:space="preserve">in console. Using</w:t>
-      </w:r>
-      <w:r>
-        <w:rPr>
-          <w:b/>
-          <w:bCs/>
-        </w:rPr>
-        <w:t xml:space="preserve"> </w:t>
-      </w:r>
-      <w:r>
-        <w:rPr>
-          <w:rStyle w:val="VerbatimChar"/>
-          <w:b/>
-          <w:bCs/>
-        </w:rPr>
-        <w:t xml:space="preserve">rep()</w:t>
-      </w:r>
-      <w:r>
-        <w:rPr>
-          <w:b/>
-          <w:bCs/>
-        </w:rPr>
-        <w:t xml:space="preserve"> </w:t>
-      </w:r>
-      <w:r>
-        <w:rPr>
-          <w:b/>
-          <w:bCs/>
-        </w:rPr>
-        <w:t xml:space="preserve">function, create a vector consisting of 1,2 and 3 repeated 20 times. Save it as a variable</w:t>
-      </w:r>
-      <w:r>
-        <w:rPr>
-          <w:b/>
-          <w:bCs/>
-        </w:rPr>
-        <w:t xml:space="preserve"> </w:t>
-      </w:r>
-      <w:r>
-        <w:rPr>
-          <w:rStyle w:val="VerbatimChar"/>
-          <w:b/>
-          <w:bCs/>
-        </w:rPr>
-        <w:t xml:space="preserve">repeated</w:t>
-      </w:r>
-      <w:r>
-        <w:rPr>
-          <w:b/>
-          <w:bCs/>
-        </w:rPr>
-        <w:t xml:space="preserve">. Call it.</w:t>
-      </w:r>
-    </w:p>
-    <w:p>
-      <w:pPr>
-        <w:pStyle w:val="SourceCode"/>
-      </w:pPr>
-      <w:r>
-        <w:rPr>
-          <w:rStyle w:val="NormalTok"/>
-        </w:rPr>
-        <w:t xml:space="preserve">repeated </w:t>
-      </w:r>
-      <w:r>
-        <w:rPr>
-          <w:rStyle w:val="OtherTok"/>
-        </w:rPr>
-        <w:t xml:space="preserve">&lt;-</w:t>
-      </w:r>
-      <w:r>
-        <w:rPr>
-          <w:rStyle w:val="NormalTok"/>
-        </w:rPr>
-        <w:t xml:space="preserve"> </w:t>
-      </w:r>
-      <w:r>
-        <w:rPr>
-          <w:rStyle w:val="FunctionTok"/>
-        </w:rPr>
-        <w:t xml:space="preserve">rep</w:t>
-      </w:r>
-      <w:r>
-        <w:rPr>
-          <w:rStyle w:val="NormalTok"/>
-        </w:rPr>
-        <w:t xml:space="preserve">(</w:t>
-      </w:r>
-      <w:r>
-        <w:rPr>
-          <w:rStyle w:val="AttributeTok"/>
-        </w:rPr>
-        <w:t xml:space="preserve">x =</w:t>
-      </w:r>
-      <w:r>
-        <w:rPr>
-          <w:rStyle w:val="NormalTok"/>
-        </w:rPr>
-        <w:t xml:space="preserve"> </w:t>
-      </w:r>
-      <w:r>
-        <w:rPr>
-          <w:rStyle w:val="FunctionTok"/>
-        </w:rPr>
-        <w:t xml:space="preserve">c</w:t>
-      </w:r>
-      <w:r>
-        <w:rPr>
-          <w:rStyle w:val="NormalTok"/>
-        </w:rPr>
-        <w:t xml:space="preserve">(</w:t>
-      </w:r>
-      <w:r>
-        <w:rPr>
-          <w:rStyle w:val="DecValTok"/>
-        </w:rPr>
-        <w:t xml:space="preserve">1</w:t>
-      </w:r>
-      <w:r>
-        <w:rPr>
-          <w:rStyle w:val="SpecialCharTok"/>
-        </w:rPr>
-        <w:t xml:space="preserve">:</w:t>
-      </w:r>
-      <w:r>
-        <w:rPr>
-          <w:rStyle w:val="DecValTok"/>
-        </w:rPr>
-        <w:t xml:space="preserve">3</w:t>
-      </w:r>
-      <w:r>
-        <w:rPr>
-          <w:rStyle w:val="NormalTok"/>
-        </w:rPr>
-        <w:t xml:space="preserve">), </w:t>
-      </w:r>
-      <w:r>
-        <w:rPr>
-          <w:rStyle w:val="AttributeTok"/>
-        </w:rPr>
-        <w:t xml:space="preserve">times =</w:t>
-      </w:r>
-      <w:r>
-        <w:rPr>
-          <w:rStyle w:val="NormalTok"/>
-        </w:rPr>
-        <w:t xml:space="preserve"> </w:t>
-      </w:r>
-      <w:r>
-        <w:rPr>
-          <w:rStyle w:val="DecValTok"/>
-        </w:rPr>
-        <w:t xml:space="preserve">20</w:t>
-      </w:r>
-      <w:r>
-        <w:rPr>
-          <w:rStyle w:val="NormalTok"/>
-        </w:rPr>
-        <w:t xml:space="preserve">)</w:t>
-      </w:r>
-      <w:r>
-        <w:br/>
-      </w:r>
-      <w:r>
-        <w:rPr>
-          <w:rStyle w:val="NormalTok"/>
-        </w:rPr>
-        <w:t xml:space="preserve">repeated</w:t>
-      </w:r>
-    </w:p>
-    <w:p>
-      <w:pPr>
-        <w:pStyle w:val="SourceCode"/>
-      </w:pPr>
-      <w:r>
-        <w:rPr>
-          <w:rStyle w:val="VerbatimChar"/>
-        </w:rPr>
-        <w:t xml:space="preserve">##  [1] 1 2 3 1 2 3 1 2 3 1 2 3 1 2 3 1 2 3 1 2 3 1 2 3 1 2 3 1 2 3 1 2 3 1 2 3 1 2</w:t>
-      </w:r>
-      <w:r>
-        <w:br/>
-      </w:r>
-      <w:r>
-        <w:rPr>
-          <w:rStyle w:val="VerbatimChar"/>
-        </w:rPr>
-        <w:t xml:space="preserve">## [39] 3 1 2 3 1 2 3 1 2 3 1 2 3 1 2 3 1 2 3 1 2 3</w:t>
-      </w:r>
-    </w:p>
-    <w:bookmarkEnd w:id="36"/>
-    <w:bookmarkStart w:id="37" w:name="exercise-17"/>
-    <w:p>
-      <w:pPr>
-        <w:pStyle w:val="Heading3"/>
-      </w:pPr>
-      <w:r>
-        <w:rPr>
-          <w:b/>
-          <w:bCs/>
-        </w:rPr>
-        <w:t xml:space="preserve">Exercise 17</w:t>
-      </w:r>
-    </w:p>
-    <w:p>
-      <w:pPr>
-        <w:pStyle w:val="FirstParagraph"/>
-      </w:pPr>
-      <w:r>
-        <w:rPr>
-          <w:b/>
-          <w:bCs/>
-        </w:rPr>
-        <w:t xml:space="preserve">Create a vector from 1 to 4 with odd numbers typed as digits and even numbers typed as words. What is the outcome? Vector of integers or vector of strings?</w:t>
-      </w:r>
-    </w:p>
-    <w:p>
-      <w:pPr>
-        <w:pStyle w:val="BodyText"/>
-      </w:pPr>
-      <w:r>
-        <w:t xml:space="preserve">Expected result:</w:t>
-      </w:r>
-    </w:p>
-    <w:p>
-      <w:pPr>
-        <w:pStyle w:val="SourceCode"/>
-      </w:pPr>
-      <w:r>
-        <w:rPr>
-          <w:rStyle w:val="NormalTok"/>
-        </w:rPr>
-        <w:t xml:space="preserve">v4 </w:t>
-      </w:r>
-      <w:r>
-        <w:rPr>
-          <w:rStyle w:val="OtherTok"/>
-        </w:rPr>
-        <w:t xml:space="preserve">&lt;-</w:t>
-      </w:r>
-      <w:r>
-        <w:rPr>
-          <w:rStyle w:val="NormalTok"/>
-        </w:rPr>
-        <w:t xml:space="preserve"> </w:t>
-      </w:r>
-      <w:r>
-        <w:rPr>
-          <w:rStyle w:val="FunctionTok"/>
-        </w:rPr>
-        <w:t xml:space="preserve">c</w:t>
-      </w:r>
-      <w:r>
-        <w:rPr>
-          <w:rStyle w:val="NormalTok"/>
-        </w:rPr>
-        <w:t xml:space="preserve">(</w:t>
-      </w:r>
-      <w:r>
-        <w:rPr>
-          <w:rStyle w:val="DecValTok"/>
-        </w:rPr>
-        <w:t xml:space="preserve">1</w:t>
-      </w:r>
-      <w:r>
-        <w:rPr>
-          <w:rStyle w:val="NormalTok"/>
-        </w:rPr>
-        <w:t xml:space="preserve">, </w:t>
-      </w:r>
-      <w:r>
-        <w:rPr>
-          <w:rStyle w:val="StringTok"/>
-        </w:rPr>
-        <w:t xml:space="preserve">"two"</w:t>
-      </w:r>
-      <w:r>
-        <w:rPr>
-          <w:rStyle w:val="NormalTok"/>
-        </w:rPr>
-        <w:t xml:space="preserve">, </w:t>
-      </w:r>
-      <w:r>
-        <w:rPr>
-          <w:rStyle w:val="DecValTok"/>
-        </w:rPr>
-        <w:t xml:space="preserve">3</w:t>
-      </w:r>
-      <w:r>
-        <w:rPr>
-          <w:rStyle w:val="NormalTok"/>
-        </w:rPr>
-        <w:t xml:space="preserve">, </w:t>
-      </w:r>
-      <w:r>
-        <w:rPr>
-          <w:rStyle w:val="StringTok"/>
-        </w:rPr>
-        <w:t xml:space="preserve">"four"</w:t>
-      </w:r>
-      <w:r>
-        <w:rPr>
-          <w:rStyle w:val="NormalTok"/>
-        </w:rPr>
-        <w:t xml:space="preserve">)</w:t>
-      </w:r>
-      <w:r>
-        <w:br/>
-      </w:r>
-      <w:r>
-        <w:rPr>
-          <w:rStyle w:val="NormalTok"/>
-        </w:rPr>
-        <w:t xml:space="preserve">v4</w:t>
-      </w:r>
-    </w:p>
-    <w:p>
-      <w:pPr>
-        <w:pStyle w:val="SourceCode"/>
-      </w:pPr>
-      <w:r>
-        <w:rPr>
-          <w:rStyle w:val="VerbatimChar"/>
-        </w:rPr>
-        <w:t xml:space="preserve">## [1] "1"    "two"  "3"    "four"</w:t>
+        <w:t xml:space="preserve"> </w:t>
+      </w:r>
+      <w:r>
+        <w:rPr>
+          <w:i/>
+          <w:iCs/>
+        </w:rPr>
+        <w:t xml:space="preserve">sign in function description).</w:t>
       </w:r>
     </w:p>
     <w:bookmarkEnd w:id="37"/>
     <w:bookmarkEnd w:id="38"/>
-    <w:bookmarkStart w:id="45" w:name="vector-machinations"/>
+    <w:bookmarkStart w:id="44" w:name="vectors"/>
     <w:p>
       <w:pPr>
         <w:pStyle w:val="Heading2"/>
       </w:pPr>
       <w:r>
+        <w:t xml:space="preserve">Vectors</w:t>
+      </w:r>
+    </w:p>
+    <w:p>
+      <w:pPr>
+        <w:pStyle w:val="FirstParagraph"/>
+      </w:pPr>
+      <w:r>
+        <w:t xml:space="preserve">A vector is a series of numbers (or strings) that are saved as a single</w:t>
+      </w:r>
+      <w:r>
+        <w:t xml:space="preserve"> </w:t>
+      </w:r>
+      <w:r>
+        <w:rPr>
+          <w:b/>
+          <w:bCs/>
+        </w:rPr>
+        <w:t xml:space="preserve">variable</w:t>
+      </w:r>
+      <w:r>
+        <w:t xml:space="preserve">. A new vector can be created with</w:t>
+      </w:r>
+      <w:r>
+        <w:t xml:space="preserve"> </w:t>
+      </w:r>
+      <w:r>
+        <w:rPr>
+          <w:rStyle w:val="VerbatimChar"/>
+        </w:rPr>
+        <w:t xml:space="preserve">c()</w:t>
+      </w:r>
+      <w:r>
+        <w:t xml:space="preserve"> </w:t>
+      </w:r>
+      <w:r>
+        <w:t xml:space="preserve">function in the following manner:</w:t>
+      </w:r>
+      <w:r>
+        <w:t xml:space="preserve"> </w:t>
+      </w:r>
+      <w:r>
+        <w:rPr>
+          <w:rStyle w:val="VerbatimChar"/>
+        </w:rPr>
+        <w:t xml:space="preserve">c(value_1,value_2,value_3,…)</w:t>
+      </w:r>
+      <w:r>
+        <w:t xml:space="preserve">.</w:t>
+      </w:r>
+    </w:p>
+    <w:bookmarkStart w:id="39" w:name="exercise-13"/>
+    <w:p>
+      <w:pPr>
+        <w:pStyle w:val="Heading3"/>
+      </w:pPr>
+      <w:r>
+        <w:rPr>
+          <w:b/>
+          <w:bCs/>
+        </w:rPr>
+        <w:t xml:space="preserve">Exercise 13</w:t>
+      </w:r>
+    </w:p>
+    <w:p>
+      <w:pPr>
+        <w:pStyle w:val="FirstParagraph"/>
+      </w:pPr>
+      <w:r>
+        <w:rPr>
+          <w:b/>
+          <w:bCs/>
+        </w:rPr>
+        <w:t xml:space="preserve">Create a vector containing integers from 5 to 10 and save it to a variable. Call it.</w:t>
+      </w:r>
+    </w:p>
+    <w:p>
+      <w:pPr>
+        <w:pStyle w:val="BodyText"/>
+      </w:pPr>
+      <w:r>
+        <w:t xml:space="preserve">Expected result:</w:t>
+      </w:r>
+    </w:p>
+    <w:p>
+      <w:pPr>
+        <w:pStyle w:val="SourceCode"/>
+      </w:pPr>
+      <w:r>
+        <w:rPr>
+          <w:rStyle w:val="NormalTok"/>
+        </w:rPr>
+        <w:t xml:space="preserve">v1 </w:t>
+      </w:r>
+      <w:r>
+        <w:rPr>
+          <w:rStyle w:val="OtherTok"/>
+        </w:rPr>
+        <w:t xml:space="preserve">&lt;-</w:t>
+      </w:r>
+      <w:r>
+        <w:rPr>
+          <w:rStyle w:val="NormalTok"/>
+        </w:rPr>
+        <w:t xml:space="preserve"> </w:t>
+      </w:r>
+      <w:r>
+        <w:rPr>
+          <w:rStyle w:val="FunctionTok"/>
+        </w:rPr>
+        <w:t xml:space="preserve">c</w:t>
+      </w:r>
+      <w:r>
+        <w:rPr>
+          <w:rStyle w:val="NormalTok"/>
+        </w:rPr>
+        <w:t xml:space="preserve">(</w:t>
+      </w:r>
+      <w:r>
+        <w:rPr>
+          <w:rStyle w:val="DecValTok"/>
+        </w:rPr>
+        <w:t xml:space="preserve">5</w:t>
+      </w:r>
+      <w:r>
+        <w:rPr>
+          <w:rStyle w:val="SpecialCharTok"/>
+        </w:rPr>
+        <w:t xml:space="preserve">:</w:t>
+      </w:r>
+      <w:r>
+        <w:rPr>
+          <w:rStyle w:val="DecValTok"/>
+        </w:rPr>
+        <w:t xml:space="preserve">10</w:t>
+      </w:r>
+      <w:r>
+        <w:rPr>
+          <w:rStyle w:val="NormalTok"/>
+        </w:rPr>
+        <w:t xml:space="preserve">)</w:t>
+      </w:r>
+      <w:r>
+        <w:br/>
+      </w:r>
+      <w:r>
+        <w:rPr>
+          <w:rStyle w:val="NormalTok"/>
+        </w:rPr>
+        <w:t xml:space="preserve">v1</w:t>
+      </w:r>
+    </w:p>
+    <w:p>
+      <w:pPr>
+        <w:pStyle w:val="SourceCode"/>
+      </w:pPr>
+      <w:r>
+        <w:rPr>
+          <w:rStyle w:val="VerbatimChar"/>
+        </w:rPr>
+        <w:t xml:space="preserve">## [1]  5  6  7  8  9 10</w:t>
+      </w:r>
+    </w:p>
+    <w:p>
+      <w:pPr>
+        <w:pStyle w:val="FirstParagraph"/>
+      </w:pPr>
+      <w:r>
+        <w:rPr>
+          <w:i/>
+          <w:iCs/>
+        </w:rPr>
+        <w:t xml:space="preserve">Tip: To create a vector of consecutive integers, you can type the limits of the range separated by a colon.</w:t>
+      </w:r>
+    </w:p>
+    <w:bookmarkEnd w:id="39"/>
+    <w:bookmarkStart w:id="40" w:name="exercise-14"/>
+    <w:p>
+      <w:pPr>
+        <w:pStyle w:val="Heading3"/>
+      </w:pPr>
+      <w:r>
+        <w:rPr>
+          <w:b/>
+          <w:bCs/>
+        </w:rPr>
+        <w:t xml:space="preserve">Exercise 14</w:t>
+      </w:r>
+    </w:p>
+    <w:p>
+      <w:pPr>
+        <w:pStyle w:val="FirstParagraph"/>
+      </w:pPr>
+      <w:r>
+        <w:rPr>
+          <w:b/>
+          <w:bCs/>
+        </w:rPr>
+        <w:t xml:space="preserve">Create a vector containing integers from 1 to 100 and save it to a variable</w:t>
+      </w:r>
+      <w:r>
+        <w:rPr>
+          <w:b/>
+          <w:bCs/>
+        </w:rPr>
+        <w:t xml:space="preserve"> </w:t>
+      </w:r>
+      <w:r>
+        <w:rPr>
+          <w:rStyle w:val="VerbatimChar"/>
+          <w:b/>
+          <w:bCs/>
+        </w:rPr>
+        <w:t xml:space="preserve">one_to_hundred</w:t>
+      </w:r>
+      <w:r>
+        <w:rPr>
+          <w:b/>
+          <w:bCs/>
+        </w:rPr>
+        <w:t xml:space="preserve">. Call it.</w:t>
+      </w:r>
+    </w:p>
+    <w:p>
+      <w:pPr>
+        <w:pStyle w:val="BodyText"/>
+      </w:pPr>
+      <w:r>
+        <w:t xml:space="preserve">Expected result:</w:t>
+      </w:r>
+    </w:p>
+    <w:p>
+      <w:pPr>
+        <w:pStyle w:val="SourceCode"/>
+      </w:pPr>
+      <w:r>
+        <w:rPr>
+          <w:rStyle w:val="NormalTok"/>
+        </w:rPr>
+        <w:t xml:space="preserve">one_to_hundred </w:t>
+      </w:r>
+      <w:r>
+        <w:rPr>
+          <w:rStyle w:val="OtherTok"/>
+        </w:rPr>
+        <w:t xml:space="preserve">&lt;-</w:t>
+      </w:r>
+      <w:r>
+        <w:rPr>
+          <w:rStyle w:val="NormalTok"/>
+        </w:rPr>
+        <w:t xml:space="preserve"> </w:t>
+      </w:r>
+      <w:r>
+        <w:rPr>
+          <w:rStyle w:val="FunctionTok"/>
+        </w:rPr>
+        <w:t xml:space="preserve">c</w:t>
+      </w:r>
+      <w:r>
+        <w:rPr>
+          <w:rStyle w:val="NormalTok"/>
+        </w:rPr>
+        <w:t xml:space="preserve">(</w:t>
+      </w:r>
+      <w:r>
+        <w:rPr>
+          <w:rStyle w:val="DecValTok"/>
+        </w:rPr>
+        <w:t xml:space="preserve">1</w:t>
+      </w:r>
+      <w:r>
+        <w:rPr>
+          <w:rStyle w:val="SpecialCharTok"/>
+        </w:rPr>
+        <w:t xml:space="preserve">:</w:t>
+      </w:r>
+      <w:r>
+        <w:rPr>
+          <w:rStyle w:val="DecValTok"/>
+        </w:rPr>
+        <w:t xml:space="preserve">100</w:t>
+      </w:r>
+      <w:r>
+        <w:rPr>
+          <w:rStyle w:val="NormalTok"/>
+        </w:rPr>
+        <w:t xml:space="preserve">)</w:t>
+      </w:r>
+      <w:r>
+        <w:br/>
+      </w:r>
+      <w:r>
+        <w:rPr>
+          <w:rStyle w:val="NormalTok"/>
+        </w:rPr>
+        <w:t xml:space="preserve">one_to_hundred</w:t>
+      </w:r>
+    </w:p>
+    <w:p>
+      <w:pPr>
+        <w:pStyle w:val="SourceCode"/>
+      </w:pPr>
+      <w:r>
+        <w:rPr>
+          <w:rStyle w:val="VerbatimChar"/>
+        </w:rPr>
+        <w:t xml:space="preserve">##   [1]   1   2   3   4   5   6   7   8   9  10  11  12  13  14  15  16  17  18</w:t>
+      </w:r>
+      <w:r>
+        <w:br/>
+      </w:r>
+      <w:r>
+        <w:rPr>
+          <w:rStyle w:val="VerbatimChar"/>
+        </w:rPr>
+        <w:t xml:space="preserve">##  [19]  19  20  21  22  23  24  25  26  27  28  29  30  31  32  33  34  35  36</w:t>
+      </w:r>
+      <w:r>
+        <w:br/>
+      </w:r>
+      <w:r>
+        <w:rPr>
+          <w:rStyle w:val="VerbatimChar"/>
+        </w:rPr>
+        <w:t xml:space="preserve">##  [37]  37  38  39  40  41  42  43  44  45  46  47  48  49  50  51  52  53  54</w:t>
+      </w:r>
+      <w:r>
+        <w:br/>
+      </w:r>
+      <w:r>
+        <w:rPr>
+          <w:rStyle w:val="VerbatimChar"/>
+        </w:rPr>
+        <w:t xml:space="preserve">##  [55]  55  56  57  58  59  60  61  62  63  64  65  66  67  68  69  70  71  72</w:t>
+      </w:r>
+      <w:r>
+        <w:br/>
+      </w:r>
+      <w:r>
+        <w:rPr>
+          <w:rStyle w:val="VerbatimChar"/>
+        </w:rPr>
+        <w:t xml:space="preserve">##  [73]  73  74  75  76  77  78  79  80  81  82  83  84  85  86  87  88  89  90</w:t>
+      </w:r>
+      <w:r>
+        <w:br/>
+      </w:r>
+      <w:r>
+        <w:rPr>
+          <w:rStyle w:val="VerbatimChar"/>
+        </w:rPr>
+        <w:t xml:space="preserve">##  [91]  91  92  93  94  95  96  97  98  99 100</w:t>
+      </w:r>
+    </w:p>
+    <w:p>
+      <w:pPr>
+        <w:pStyle w:val="FirstParagraph"/>
+      </w:pPr>
+      <w:r>
+        <w:rPr>
+          <w:i/>
+          <w:iCs/>
+        </w:rPr>
+        <w:t xml:space="preserve">Advice: Note that concerning ranges, R is fully inclusive, which means that both limits of the range will be included in the outcome.</w:t>
+      </w:r>
+    </w:p>
+    <w:p>
+      <w:pPr>
+        <w:pStyle w:val="BodyText"/>
+      </w:pPr>
+      <w:r>
+        <w:t xml:space="preserve">To create a vector of consecutive numbers that differ by a given value, use the</w:t>
+      </w:r>
+      <w:r>
+        <w:t xml:space="preserve"> </w:t>
+      </w:r>
+      <w:r>
+        <w:rPr>
+          <w:rStyle w:val="VerbatimChar"/>
+        </w:rPr>
+        <w:t xml:space="preserve">seq()</w:t>
+      </w:r>
+      <w:r>
+        <w:t xml:space="preserve"> </w:t>
+      </w:r>
+      <w:r>
+        <w:t xml:space="preserve">function. Note that the function will return a vector, so there is no need to use</w:t>
+      </w:r>
+      <w:r>
+        <w:t xml:space="preserve"> </w:t>
+      </w:r>
+      <w:r>
+        <w:rPr>
+          <w:rStyle w:val="VerbatimChar"/>
+        </w:rPr>
+        <w:t xml:space="preserve">c()</w:t>
+      </w:r>
+      <w:r>
+        <w:t xml:space="preserve">.</w:t>
+      </w:r>
+    </w:p>
+    <w:bookmarkEnd w:id="40"/>
+    <w:bookmarkStart w:id="41" w:name="exercise-15"/>
+    <w:p>
+      <w:pPr>
+        <w:pStyle w:val="Heading3"/>
+      </w:pPr>
+      <w:r>
+        <w:rPr>
+          <w:b/>
+          <w:bCs/>
+        </w:rPr>
+        <w:t xml:space="preserve">Exercise 15</w:t>
+      </w:r>
+    </w:p>
+    <w:p>
+      <w:pPr>
+        <w:pStyle w:val="FirstParagraph"/>
+      </w:pPr>
+      <w:r>
+        <w:rPr>
+          <w:b/>
+          <w:bCs/>
+        </w:rPr>
+        <w:t xml:space="preserve">Access the</w:t>
+      </w:r>
+      <w:r>
+        <w:rPr>
+          <w:b/>
+          <w:bCs/>
+        </w:rPr>
+        <w:t xml:space="preserve"> </w:t>
+      </w:r>
+      <w:r>
+        <w:rPr>
+          <w:rStyle w:val="VerbatimChar"/>
+          <w:b/>
+          <w:bCs/>
+        </w:rPr>
+        <w:t xml:space="preserve">seq()</w:t>
+      </w:r>
+      <w:r>
+        <w:rPr>
+          <w:b/>
+          <w:bCs/>
+        </w:rPr>
+        <w:t xml:space="preserve"> </w:t>
+      </w:r>
+      <w:r>
+        <w:rPr>
+          <w:b/>
+          <w:bCs/>
+        </w:rPr>
+        <w:t xml:space="preserve">manual. Using the</w:t>
+      </w:r>
+      <w:r>
+        <w:rPr>
+          <w:b/>
+          <w:bCs/>
+        </w:rPr>
+        <w:t xml:space="preserve"> </w:t>
+      </w:r>
+      <w:r>
+        <w:rPr>
+          <w:rStyle w:val="VerbatimChar"/>
+          <w:b/>
+          <w:bCs/>
+        </w:rPr>
+        <w:t xml:space="preserve">seq()</w:t>
+      </w:r>
+      <w:r>
+        <w:rPr>
+          <w:b/>
+          <w:bCs/>
+        </w:rPr>
+        <w:t xml:space="preserve"> </w:t>
+      </w:r>
+      <w:r>
+        <w:rPr>
+          <w:b/>
+          <w:bCs/>
+        </w:rPr>
+        <w:t xml:space="preserve">function, create a vector of numbers between 0 and 1 that differ by 0.1.</w:t>
+      </w:r>
+    </w:p>
+    <w:p>
+      <w:pPr>
+        <w:pStyle w:val="BodyText"/>
+      </w:pPr>
+      <w:r>
+        <w:t xml:space="preserve">Expected result:</w:t>
+      </w:r>
+    </w:p>
+    <w:p>
+      <w:pPr>
+        <w:pStyle w:val="SourceCode"/>
+      </w:pPr>
+      <w:r>
+        <w:rPr>
+          <w:rStyle w:val="NormalTok"/>
+        </w:rPr>
+        <w:t xml:space="preserve">v2 </w:t>
+      </w:r>
+      <w:r>
+        <w:rPr>
+          <w:rStyle w:val="OtherTok"/>
+        </w:rPr>
+        <w:t xml:space="preserve">&lt;-</w:t>
+      </w:r>
+      <w:r>
+        <w:rPr>
+          <w:rStyle w:val="NormalTok"/>
+        </w:rPr>
+        <w:t xml:space="preserve"> </w:t>
+      </w:r>
+      <w:r>
+        <w:rPr>
+          <w:rStyle w:val="FunctionTok"/>
+        </w:rPr>
+        <w:t xml:space="preserve">seq</w:t>
+      </w:r>
+      <w:r>
+        <w:rPr>
+          <w:rStyle w:val="NormalTok"/>
+        </w:rPr>
+        <w:t xml:space="preserve">(</w:t>
+      </w:r>
+      <w:r>
+        <w:rPr>
+          <w:rStyle w:val="AttributeTok"/>
+        </w:rPr>
+        <w:t xml:space="preserve">from =</w:t>
+      </w:r>
+      <w:r>
+        <w:rPr>
+          <w:rStyle w:val="NormalTok"/>
+        </w:rPr>
+        <w:t xml:space="preserve"> </w:t>
+      </w:r>
+      <w:r>
+        <w:rPr>
+          <w:rStyle w:val="DecValTok"/>
+        </w:rPr>
+        <w:t xml:space="preserve">0</w:t>
+      </w:r>
+      <w:r>
+        <w:rPr>
+          <w:rStyle w:val="NormalTok"/>
+        </w:rPr>
+        <w:t xml:space="preserve">, </w:t>
+      </w:r>
+      <w:r>
+        <w:rPr>
+          <w:rStyle w:val="AttributeTok"/>
+        </w:rPr>
+        <w:t xml:space="preserve">to =</w:t>
+      </w:r>
+      <w:r>
+        <w:rPr>
+          <w:rStyle w:val="NormalTok"/>
+        </w:rPr>
+        <w:t xml:space="preserve"> </w:t>
+      </w:r>
+      <w:r>
+        <w:rPr>
+          <w:rStyle w:val="DecValTok"/>
+        </w:rPr>
+        <w:t xml:space="preserve">1</w:t>
+      </w:r>
+      <w:r>
+        <w:rPr>
+          <w:rStyle w:val="NormalTok"/>
+        </w:rPr>
+        <w:t xml:space="preserve">, </w:t>
+      </w:r>
+      <w:r>
+        <w:rPr>
+          <w:rStyle w:val="AttributeTok"/>
+        </w:rPr>
+        <w:t xml:space="preserve">by =</w:t>
+      </w:r>
+      <w:r>
+        <w:rPr>
+          <w:rStyle w:val="NormalTok"/>
+        </w:rPr>
+        <w:t xml:space="preserve"> </w:t>
+      </w:r>
+      <w:r>
+        <w:rPr>
+          <w:rStyle w:val="FloatTok"/>
+        </w:rPr>
+        <w:t xml:space="preserve">0.1</w:t>
+      </w:r>
+      <w:r>
+        <w:rPr>
+          <w:rStyle w:val="NormalTok"/>
+        </w:rPr>
+        <w:t xml:space="preserve">)</w:t>
+      </w:r>
+      <w:r>
+        <w:br/>
+      </w:r>
+      <w:r>
+        <w:rPr>
+          <w:rStyle w:val="NormalTok"/>
+        </w:rPr>
+        <w:t xml:space="preserve">v2</w:t>
+      </w:r>
+    </w:p>
+    <w:p>
+      <w:pPr>
+        <w:pStyle w:val="SourceCode"/>
+      </w:pPr>
+      <w:r>
+        <w:rPr>
+          <w:rStyle w:val="VerbatimChar"/>
+        </w:rPr>
+        <w:t xml:space="preserve">##  [1] 0.0 0.1 0.2 0.3 0.4 0.5 0.6 0.7 0.8 0.9 1.0</w:t>
+      </w:r>
+    </w:p>
+    <w:p>
+      <w:pPr>
+        <w:pStyle w:val="FirstParagraph"/>
+      </w:pPr>
+      <w:r>
+        <w:t xml:space="preserve">To create a vector of repeated values, use the</w:t>
+      </w:r>
+      <w:r>
+        <w:t xml:space="preserve"> </w:t>
+      </w:r>
+      <w:r>
+        <w:rPr>
+          <w:rStyle w:val="VerbatimChar"/>
+        </w:rPr>
+        <w:t xml:space="preserve">rep()</w:t>
+      </w:r>
+      <w:r>
+        <w:t xml:space="preserve"> </w:t>
+      </w:r>
+      <w:r>
+        <w:t xml:space="preserve">function.</w:t>
+      </w:r>
+    </w:p>
+    <w:bookmarkEnd w:id="41"/>
+    <w:bookmarkStart w:id="42" w:name="exercise-16"/>
+    <w:p>
+      <w:pPr>
+        <w:pStyle w:val="Heading3"/>
+      </w:pPr>
+      <w:r>
+        <w:rPr>
+          <w:b/>
+          <w:bCs/>
+        </w:rPr>
+        <w:t xml:space="preserve">Exercise 16</w:t>
+      </w:r>
+    </w:p>
+    <w:p>
+      <w:pPr>
+        <w:pStyle w:val="FirstParagraph"/>
+      </w:pPr>
+      <w:r>
+        <w:rPr>
+          <w:b/>
+          <w:bCs/>
+        </w:rPr>
+        <w:t xml:space="preserve">Access the</w:t>
+      </w:r>
+      <w:r>
+        <w:rPr>
+          <w:b/>
+          <w:bCs/>
+        </w:rPr>
+        <w:t xml:space="preserve"> </w:t>
+      </w:r>
+      <w:r>
+        <w:rPr>
+          <w:rStyle w:val="VerbatimChar"/>
+          <w:b/>
+          <w:bCs/>
+        </w:rPr>
+        <w:t xml:space="preserve">rep()</w:t>
+      </w:r>
+      <w:r>
+        <w:rPr>
+          <w:b/>
+          <w:bCs/>
+        </w:rPr>
+        <w:t xml:space="preserve"> </w:t>
+      </w:r>
+      <w:r>
+        <w:rPr>
+          <w:b/>
+          <w:bCs/>
+        </w:rPr>
+        <w:t xml:space="preserve">manual. Using the</w:t>
+      </w:r>
+      <w:r>
+        <w:rPr>
+          <w:b/>
+          <w:bCs/>
+        </w:rPr>
+        <w:t xml:space="preserve"> </w:t>
+      </w:r>
+      <w:r>
+        <w:rPr>
+          <w:rStyle w:val="VerbatimChar"/>
+          <w:b/>
+          <w:bCs/>
+        </w:rPr>
+        <w:t xml:space="preserve">rep()</w:t>
+      </w:r>
+      <w:r>
+        <w:rPr>
+          <w:b/>
+          <w:bCs/>
+        </w:rPr>
+        <w:t xml:space="preserve"> </w:t>
+      </w:r>
+      <w:r>
+        <w:rPr>
+          <w:b/>
+          <w:bCs/>
+        </w:rPr>
+        <w:t xml:space="preserve">function, create a vector consisting of 1,2, and 3 repeated 20 times. Save it as a variable</w:t>
+      </w:r>
+      <w:r>
+        <w:rPr>
+          <w:b/>
+          <w:bCs/>
+        </w:rPr>
+        <w:t xml:space="preserve"> </w:t>
+      </w:r>
+      <w:r>
+        <w:rPr>
+          <w:rStyle w:val="VerbatimChar"/>
+          <w:b/>
+          <w:bCs/>
+        </w:rPr>
+        <w:t xml:space="preserve">repeated</w:t>
+      </w:r>
+      <w:r>
+        <w:rPr>
+          <w:b/>
+          <w:bCs/>
+        </w:rPr>
+        <w:t xml:space="preserve">. Call it.</w:t>
+      </w:r>
+    </w:p>
+    <w:p>
+      <w:pPr>
+        <w:pStyle w:val="SourceCode"/>
+      </w:pPr>
+      <w:r>
+        <w:rPr>
+          <w:rStyle w:val="NormalTok"/>
+        </w:rPr>
+        <w:t xml:space="preserve">repeated </w:t>
+      </w:r>
+      <w:r>
+        <w:rPr>
+          <w:rStyle w:val="OtherTok"/>
+        </w:rPr>
+        <w:t xml:space="preserve">&lt;-</w:t>
+      </w:r>
+      <w:r>
+        <w:rPr>
+          <w:rStyle w:val="NormalTok"/>
+        </w:rPr>
+        <w:t xml:space="preserve"> </w:t>
+      </w:r>
+      <w:r>
+        <w:rPr>
+          <w:rStyle w:val="FunctionTok"/>
+        </w:rPr>
+        <w:t xml:space="preserve">rep</w:t>
+      </w:r>
+      <w:r>
+        <w:rPr>
+          <w:rStyle w:val="NormalTok"/>
+        </w:rPr>
+        <w:t xml:space="preserve">(</w:t>
+      </w:r>
+      <w:r>
+        <w:rPr>
+          <w:rStyle w:val="AttributeTok"/>
+        </w:rPr>
+        <w:t xml:space="preserve">x =</w:t>
+      </w:r>
+      <w:r>
+        <w:rPr>
+          <w:rStyle w:val="NormalTok"/>
+        </w:rPr>
+        <w:t xml:space="preserve"> </w:t>
+      </w:r>
+      <w:r>
+        <w:rPr>
+          <w:rStyle w:val="FunctionTok"/>
+        </w:rPr>
+        <w:t xml:space="preserve">c</w:t>
+      </w:r>
+      <w:r>
+        <w:rPr>
+          <w:rStyle w:val="NormalTok"/>
+        </w:rPr>
+        <w:t xml:space="preserve">(</w:t>
+      </w:r>
+      <w:r>
+        <w:rPr>
+          <w:rStyle w:val="DecValTok"/>
+        </w:rPr>
+        <w:t xml:space="preserve">1</w:t>
+      </w:r>
+      <w:r>
+        <w:rPr>
+          <w:rStyle w:val="SpecialCharTok"/>
+        </w:rPr>
+        <w:t xml:space="preserve">:</w:t>
+      </w:r>
+      <w:r>
+        <w:rPr>
+          <w:rStyle w:val="DecValTok"/>
+        </w:rPr>
+        <w:t xml:space="preserve">3</w:t>
+      </w:r>
+      <w:r>
+        <w:rPr>
+          <w:rStyle w:val="NormalTok"/>
+        </w:rPr>
+        <w:t xml:space="preserve">), </w:t>
+      </w:r>
+      <w:r>
+        <w:rPr>
+          <w:rStyle w:val="AttributeTok"/>
+        </w:rPr>
+        <w:t xml:space="preserve">times =</w:t>
+      </w:r>
+      <w:r>
+        <w:rPr>
+          <w:rStyle w:val="NormalTok"/>
+        </w:rPr>
+        <w:t xml:space="preserve"> </w:t>
+      </w:r>
+      <w:r>
+        <w:rPr>
+          <w:rStyle w:val="DecValTok"/>
+        </w:rPr>
+        <w:t xml:space="preserve">20</w:t>
+      </w:r>
+      <w:r>
+        <w:rPr>
+          <w:rStyle w:val="NormalTok"/>
+        </w:rPr>
+        <w:t xml:space="preserve">)</w:t>
+      </w:r>
+      <w:r>
+        <w:br/>
+      </w:r>
+      <w:r>
+        <w:rPr>
+          <w:rStyle w:val="NormalTok"/>
+        </w:rPr>
+        <w:t xml:space="preserve">repeated</w:t>
+      </w:r>
+    </w:p>
+    <w:p>
+      <w:pPr>
+        <w:pStyle w:val="SourceCode"/>
+      </w:pPr>
+      <w:r>
+        <w:rPr>
+          <w:rStyle w:val="VerbatimChar"/>
+        </w:rPr>
+        <w:t xml:space="preserve">##  [1] 1 2 3 1 2 3 1 2 3 1 2 3 1 2 3 1 2 3 1 2 3 1 2 3 1 2 3 1 2 3 1 2 3 1 2 3 1 2</w:t>
+      </w:r>
+      <w:r>
+        <w:br/>
+      </w:r>
+      <w:r>
+        <w:rPr>
+          <w:rStyle w:val="VerbatimChar"/>
+        </w:rPr>
+        <w:t xml:space="preserve">## [39] 3 1 2 3 1 2 3 1 2 3 1 2 3 1 2 3 1 2 3 1 2 3</w:t>
+      </w:r>
+    </w:p>
+    <w:bookmarkEnd w:id="42"/>
+    <w:bookmarkStart w:id="43" w:name="exercise-17"/>
+    <w:p>
+      <w:pPr>
+        <w:pStyle w:val="Heading3"/>
+      </w:pPr>
+      <w:r>
+        <w:rPr>
+          <w:b/>
+          <w:bCs/>
+        </w:rPr>
+        <w:t xml:space="preserve">Exercise 17</w:t>
+      </w:r>
+    </w:p>
+    <w:p>
+      <w:pPr>
+        <w:pStyle w:val="FirstParagraph"/>
+      </w:pPr>
+      <w:r>
+        <w:rPr>
+          <w:b/>
+          <w:bCs/>
+        </w:rPr>
+        <w:t xml:space="preserve">Create a vector from 1 to 4 with odd numbers typed as digits and even numbers typed as words. What is the outcome? Vector of integers or vector of strings?</w:t>
+      </w:r>
+    </w:p>
+    <w:p>
+      <w:pPr>
+        <w:pStyle w:val="BodyText"/>
+      </w:pPr>
+      <w:r>
+        <w:t xml:space="preserve">Expected result:</w:t>
+      </w:r>
+    </w:p>
+    <w:p>
+      <w:pPr>
+        <w:pStyle w:val="SourceCode"/>
+      </w:pPr>
+      <w:r>
+        <w:rPr>
+          <w:rStyle w:val="NormalTok"/>
+        </w:rPr>
+        <w:t xml:space="preserve">v4 </w:t>
+      </w:r>
+      <w:r>
+        <w:rPr>
+          <w:rStyle w:val="OtherTok"/>
+        </w:rPr>
+        <w:t xml:space="preserve">&lt;-</w:t>
+      </w:r>
+      <w:r>
+        <w:rPr>
+          <w:rStyle w:val="NormalTok"/>
+        </w:rPr>
+        <w:t xml:space="preserve"> </w:t>
+      </w:r>
+      <w:r>
+        <w:rPr>
+          <w:rStyle w:val="FunctionTok"/>
+        </w:rPr>
+        <w:t xml:space="preserve">c</w:t>
+      </w:r>
+      <w:r>
+        <w:rPr>
+          <w:rStyle w:val="NormalTok"/>
+        </w:rPr>
+        <w:t xml:space="preserve">(</w:t>
+      </w:r>
+      <w:r>
+        <w:rPr>
+          <w:rStyle w:val="DecValTok"/>
+        </w:rPr>
+        <w:t xml:space="preserve">1</w:t>
+      </w:r>
+      <w:r>
+        <w:rPr>
+          <w:rStyle w:val="NormalTok"/>
+        </w:rPr>
+        <w:t xml:space="preserve">, </w:t>
+      </w:r>
+      <w:r>
+        <w:rPr>
+          <w:rStyle w:val="StringTok"/>
+        </w:rPr>
+        <w:t xml:space="preserve">"two"</w:t>
+      </w:r>
+      <w:r>
+        <w:rPr>
+          <w:rStyle w:val="NormalTok"/>
+        </w:rPr>
+        <w:t xml:space="preserve">, </w:t>
+      </w:r>
+      <w:r>
+        <w:rPr>
+          <w:rStyle w:val="DecValTok"/>
+        </w:rPr>
+        <w:t xml:space="preserve">3</w:t>
+      </w:r>
+      <w:r>
+        <w:rPr>
+          <w:rStyle w:val="NormalTok"/>
+        </w:rPr>
+        <w:t xml:space="preserve">, </w:t>
+      </w:r>
+      <w:r>
+        <w:rPr>
+          <w:rStyle w:val="StringTok"/>
+        </w:rPr>
+        <w:t xml:space="preserve">"four"</w:t>
+      </w:r>
+      <w:r>
+        <w:rPr>
+          <w:rStyle w:val="NormalTok"/>
+        </w:rPr>
+        <w:t xml:space="preserve">)</w:t>
+      </w:r>
+      <w:r>
+        <w:br/>
+      </w:r>
+      <w:r>
+        <w:rPr>
+          <w:rStyle w:val="NormalTok"/>
+        </w:rPr>
+        <w:t xml:space="preserve">v4</w:t>
+      </w:r>
+    </w:p>
+    <w:p>
+      <w:pPr>
+        <w:pStyle w:val="SourceCode"/>
+      </w:pPr>
+      <w:r>
+        <w:rPr>
+          <w:rStyle w:val="VerbatimChar"/>
+        </w:rPr>
+        <w:t xml:space="preserve">## [1] "1"    "two"  "3"    "four"</w:t>
+      </w:r>
+    </w:p>
+    <w:bookmarkEnd w:id="43"/>
+    <w:bookmarkEnd w:id="44"/>
+    <w:bookmarkStart w:id="51" w:name="vector-machinations"/>
+    <w:p>
+      <w:pPr>
+        <w:pStyle w:val="Heading2"/>
+      </w:pPr>
+      <w:r>
         <w:t xml:space="preserve">Vector machinations</w:t>
       </w:r>
     </w:p>
@@ -5019,7 +5179,7 @@
         <w:t xml:space="preserve">- round numbers (to integers by default)</w:t>
       </w:r>
     </w:p>
-    <w:bookmarkStart w:id="39" w:name="exercise-18"/>
+    <w:bookmarkStart w:id="45" w:name="exercise-18"/>
     <w:p>
       <w:pPr>
         <w:pStyle w:val="Heading3"/>
@@ -5137,8 +5297,8 @@
         <w:t xml:space="preserve">## [1] 50.5</w:t>
       </w:r>
     </w:p>
-    <w:bookmarkEnd w:id="39"/>
-    <w:bookmarkStart w:id="43" w:name="exercise-19"/>
+    <w:bookmarkEnd w:id="45"/>
+    <w:bookmarkStart w:id="49" w:name="exercise-19"/>
     <w:p>
       <w:pPr>
         <w:pStyle w:val="Heading3"/>
@@ -5270,23 +5430,23 @@
         <w:pStyle w:val="FirstParagraph"/>
       </w:pPr>
       <w:r>
-        <w:t xml:space="preserve">Vectors can be also used in typical mathematical operations. However there is one important rule:</w:t>
-      </w:r>
-      <w:r>
-        <w:t xml:space="preserve"> </w:t>
-      </w:r>
-      <w:r>
-        <w:rPr>
-          <w:b/>
-          <w:bCs/>
-        </w:rPr>
-        <w:t xml:space="preserve">shorter vector will be repeated until it reaches length of longer one</w:t>
-      </w:r>
-      <w:r>
-        <w:t xml:space="preserve"> </w:t>
-      </w:r>
-      <w:r>
-        <w:t xml:space="preserve">(single number is treated as vector of length 1).</w:t>
+        <w:t xml:space="preserve">Vectors can also be used in typical mathematical operations. However, there is one important rule:</w:t>
+      </w:r>
+      <w:r>
+        <w:t xml:space="preserve"> </w:t>
+      </w:r>
+      <w:r>
+        <w:rPr>
+          <w:b/>
+          <w:bCs/>
+        </w:rPr>
+        <w:t xml:space="preserve">the shorter vector will be repeated until it reaches the length of the longer one</w:t>
+      </w:r>
+      <w:r>
+        <w:t xml:space="preserve"> </w:t>
+      </w:r>
+      <w:r>
+        <w:t xml:space="preserve">(a single number is treated as a vector of length 1).</w:t>
       </w:r>
     </w:p>
     <w:p>
@@ -5900,18 +6060,18 @@
           <wp:inline>
             <wp:extent cx="5334000" cy="1857977"/>
             <wp:effectExtent b="0" l="0" r="0" t="0"/>
-            <wp:docPr descr="" title="" id="41" name="Picture"/>
+            <wp:docPr descr="" title="" id="47" name="Picture"/>
             <a:graphic>
               <a:graphicData uri="http://schemas.openxmlformats.org/drawingml/2006/picture">
                 <pic:pic>
                   <pic:nvPicPr>
-                    <pic:cNvPr descr="vector_recycling.png" id="42" name="Picture"/>
+                    <pic:cNvPr descr="vector_recycling.png" id="48" name="Picture"/>
                     <pic:cNvPicPr>
                       <a:picLocks noChangeArrowheads="1" noChangeAspect="1"/>
                     </pic:cNvPicPr>
                   </pic:nvPicPr>
                   <pic:blipFill>
-                    <a:blip r:embed="rId40"/>
+                    <a:blip r:embed="rId46"/>
                     <a:stretch>
                       <a:fillRect/>
                     </a:stretch>
@@ -6067,8 +6227,8 @@
         <w:t xml:space="preserve">##  [8] "dog 8"   "mouse 9" "cat 10"</w:t>
       </w:r>
     </w:p>
-    <w:bookmarkEnd w:id="43"/>
-    <w:bookmarkStart w:id="44" w:name="exercise-20"/>
+    <w:bookmarkEnd w:id="49"/>
+    <w:bookmarkStart w:id="50" w:name="exercise-20"/>
     <w:p>
       <w:pPr>
         <w:pStyle w:val="Heading3"/>
@@ -6299,9 +6459,9 @@
         <w:t xml:space="preserve">## [100] 1000000</w:t>
       </w:r>
     </w:p>
-    <w:bookmarkEnd w:id="44"/>
-    <w:bookmarkEnd w:id="45"/>
-    <w:bookmarkStart w:id="50" w:name="accessing-elements-of-a-vector"/>
+    <w:bookmarkEnd w:id="50"/>
+    <w:bookmarkEnd w:id="51"/>
+    <w:bookmarkStart w:id="56" w:name="accessing-elements-of-a-vector"/>
     <w:p>
       <w:pPr>
         <w:pStyle w:val="Heading2"/>
@@ -6315,7 +6475,7 @@
         <w:pStyle w:val="FirstParagraph"/>
       </w:pPr>
       <w:r>
-        <w:t xml:space="preserve">Vector can be</w:t>
+        <w:t xml:space="preserve">A vector can be</w:t>
       </w:r>
       <w:r>
         <w:t xml:space="preserve"> </w:t>
@@ -6359,10 +6519,10 @@
         <w:t xml:space="preserve"> </w:t>
       </w:r>
       <w:r>
-        <w:t xml:space="preserve">is the position of the value in the vector, e.g. 1st, 3rd, 25th, etc.</w:t>
-      </w:r>
-    </w:p>
-    <w:bookmarkStart w:id="46" w:name="exercise-21"/>
+        <w:t xml:space="preserve">is the position of the value in the vector, e.g., 1st, 3rd, 25th, etc.</w:t>
+      </w:r>
+    </w:p>
+    <w:bookmarkStart w:id="52" w:name="exercise-21"/>
     <w:p>
       <w:pPr>
         <w:pStyle w:val="Heading3"/>
@@ -6384,7 +6544,7 @@
           <w:b/>
           <w:bCs/>
         </w:rPr>
-        <w:t xml:space="preserve">Return 15th element of the vector</w:t>
+        <w:t xml:space="preserve">Return the 15th element of the vector</w:t>
       </w:r>
       <w:r>
         <w:rPr>
@@ -6451,8 +6611,8 @@
         <w:t xml:space="preserve">## [1] 3375</w:t>
       </w:r>
     </w:p>
-    <w:bookmarkEnd w:id="46"/>
-    <w:bookmarkStart w:id="47" w:name="exercise-22"/>
+    <w:bookmarkEnd w:id="52"/>
+    <w:bookmarkStart w:id="53" w:name="exercise-22"/>
     <w:p>
       <w:pPr>
         <w:pStyle w:val="Heading3"/>
@@ -6474,7 +6634,7 @@
           <w:b/>
           <w:bCs/>
         </w:rPr>
-        <w:t xml:space="preserve">Return 2nd to 20th element of the vector</w:t>
+        <w:t xml:space="preserve">Return the 2nd to 20th element of the vector</w:t>
       </w:r>
       <w:r>
         <w:rPr>
@@ -6574,8 +6734,8 @@
         <w:t xml:space="preserve">## [16] 4913 5832 6859 8000</w:t>
       </w:r>
     </w:p>
-    <w:bookmarkEnd w:id="47"/>
-    <w:bookmarkStart w:id="48" w:name="exercise-23"/>
+    <w:bookmarkEnd w:id="53"/>
+    <w:bookmarkStart w:id="54" w:name="exercise-23"/>
     <w:p>
       <w:pPr>
         <w:pStyle w:val="Heading3"/>
@@ -6597,7 +6757,7 @@
           <w:b/>
           <w:bCs/>
         </w:rPr>
-        <w:t xml:space="preserve">Return 15th, 30th and 45th element of the vector</w:t>
+        <w:t xml:space="preserve">Return the 15th, 30th, and 45th elements of the vector</w:t>
       </w:r>
       <w:r>
         <w:rPr>
@@ -6712,8 +6872,8 @@
         <w:t xml:space="preserve">## [1]  3375 27000 91125</w:t>
       </w:r>
     </w:p>
-    <w:bookmarkEnd w:id="48"/>
-    <w:bookmarkStart w:id="49" w:name="exercise-24"/>
+    <w:bookmarkEnd w:id="54"/>
+    <w:bookmarkStart w:id="55" w:name="exercise-24"/>
     <w:p>
       <w:pPr>
         <w:pStyle w:val="Heading3"/>
@@ -6776,7 +6936,7 @@
           <w:i/>
           <w:iCs/>
         </w:rPr>
-        <w:t xml:space="preserve">Tip : While creating a vector you can combine both ranges and single indexes with</w:t>
+        <w:t xml:space="preserve">Tip: While creating a vector, you can combine both ranges and single indexes with</w:t>
       </w:r>
       <w:r>
         <w:rPr>
@@ -6928,9 +7088,9 @@
         <w:t xml:space="preserve">## [11]  64000 166375</w:t>
       </w:r>
     </w:p>
-    <w:bookmarkEnd w:id="49"/>
-    <w:bookmarkEnd w:id="50"/>
-    <w:bookmarkStart w:id="51" w:name="before-leaving"/>
+    <w:bookmarkEnd w:id="55"/>
+    <w:bookmarkEnd w:id="56"/>
+    <w:bookmarkStart w:id="57" w:name="before-leaving"/>
     <w:p>
       <w:pPr>
         <w:pStyle w:val="Heading2"/>
@@ -7015,8 +7175,8 @@
         <w:t xml:space="preserve"># displays where the file was saved</w:t>
       </w:r>
     </w:p>
-    <w:bookmarkEnd w:id="51"/>
-    <w:bookmarkStart w:id="52" w:name="homework"/>
+    <w:bookmarkEnd w:id="57"/>
+    <w:bookmarkStart w:id="58" w:name="homework"/>
     <w:p>
       <w:pPr>
         <w:pStyle w:val="Heading2"/>
@@ -7140,7 +7300,7 @@
         <w:t xml:space="preserve">days</w:t>
       </w:r>
       <w:r>
-        <w:t xml:space="preserve">. The vector should have 12 elements and contain only numbers. Assume it is not a leap-year.</w:t>
+        <w:t xml:space="preserve">. The vector should have 12 elements and contain only numbers. Assume it is not a leap year.</w:t>
       </w:r>
       <w:r>
         <w:br/>
@@ -7158,10 +7318,7 @@
         <w:t xml:space="preserve">days</w:t>
       </w:r>
       <w:r>
-        <w:t xml:space="preserve"> </w:t>
-      </w:r>
-      <w:r>
-        <w:t xml:space="preserve">find the median number of days in a month and save it to a new variable called</w:t>
+        <w:t xml:space="preserve">, find the median number of days in a month and save it to a new variable called</w:t>
       </w:r>
       <w:r>
         <w:t xml:space="preserve"> </w:t>
@@ -7191,19 +7348,46 @@
         <w:t xml:space="preserve">days</w:t>
       </w:r>
       <w:r>
-        <w:t xml:space="preserve"> </w:t>
-      </w:r>
-      <w:r>
-        <w:t xml:space="preserve">find the difference (in days) between the longest and shortest month and save it to a new variable called</w:t>
-      </w:r>
-      <w:r>
-        <w:t xml:space="preserve"> </w:t>
-      </w:r>
-      <w:r>
-        <w:rPr>
-          <w:rStyle w:val="VerbatimChar"/>
-        </w:rPr>
-        <w:t xml:space="preserve">difference_days</w:t>
+        <w:t xml:space="preserve">, find the difference (in days) between the longest and shortest month and save it to a new variable called</w:t>
+      </w:r>
+      <w:r>
+        <w:t xml:space="preserve"> </w:t>
+      </w:r>
+      <w:r>
+        <w:rPr>
+          <w:rStyle w:val="VerbatimChar"/>
+        </w:rPr>
+        <w:t xml:space="preserve">range_days</w:t>
+      </w:r>
+      <w:r>
+        <w:t xml:space="preserve">. Find the longest and shortest month using R functions.</w:t>
+      </w:r>
+      <w:r>
+        <w:t xml:space="preserve"> </w:t>
+      </w:r>
+      <w:r>
+        <w:t xml:space="preserve">4. Using vector</w:t>
+      </w:r>
+      <w:r>
+        <w:t xml:space="preserve"> </w:t>
+      </w:r>
+      <w:r>
+        <w:rPr>
+          <w:rStyle w:val="VerbatimChar"/>
+        </w:rPr>
+        <w:t xml:space="preserve">days</w:t>
+      </w:r>
+      <w:r>
+        <w:t xml:space="preserve">, get a vector of unique month lengths and call a new vector</w:t>
+      </w:r>
+      <w:r>
+        <w:t xml:space="preserve"> </w:t>
+      </w:r>
+      <w:r>
+        <w:rPr>
+          <w:rStyle w:val="VerbatimChar"/>
+        </w:rPr>
+        <w:t xml:space="preserve">month_length</w:t>
       </w:r>
       <w:r>
         <w:t xml:space="preserve">.</w:t>
@@ -7212,7 +7396,7 @@
         <w:br/>
       </w:r>
       <w:r>
-        <w:t xml:space="preserve">4. Using vector</w:t>
+        <w:t xml:space="preserve">5. Overwrite the</w:t>
       </w:r>
       <w:r>
         <w:t xml:space="preserve"> </w:t>
@@ -7227,31 +7411,13 @@
         <w:t xml:space="preserve"> </w:t>
       </w:r>
       <w:r>
-        <w:t xml:space="preserve">get a vector of unique month lengths and call a new vector</w:t>
-      </w:r>
-      <w:r>
-        <w:t xml:space="preserve"> </w:t>
-      </w:r>
-      <w:r>
-        <w:rPr>
-          <w:rStyle w:val="VerbatimChar"/>
-        </w:rPr>
-        <w:t xml:space="preserve">month_length</w:t>
-      </w:r>
-      <w:r>
-        <w:t xml:space="preserve">.</w:t>
-      </w:r>
-      <w:r>
-        <w:br/>
-      </w:r>
-      <w:r>
-        <w:t xml:space="preserve">5. Overwrite the days vector by replacing it with the number of minutes in each month .</w:t>
-      </w:r>
-      <w:r>
-        <w:t xml:space="preserve"> </w:t>
-      </w:r>
-    </w:p>
-    <w:bookmarkEnd w:id="52"/>
+        <w:t xml:space="preserve">vector by replacing it with the number of minutes in each month.</w:t>
+      </w:r>
+      <w:r>
+        <w:t xml:space="preserve"> </w:t>
+      </w:r>
+    </w:p>
+    <w:bookmarkEnd w:id="58"/>
     <w:sectPr>
       <w:footnotePr>
         <w:numRestart w:val="eachSect"/>

</xml_diff>